<commit_message>
Update docs and logs: sync latest report results for assignments II, III, and Lagrange
Updated the run output for Assignment II, synced the latest Richardson extrapolation analysis in Assignment III docx, and updated the Barycentric Lagrange report in assignment 4.
</commit_message>
<xml_diff>
--- a/Assignment-III/Assignment_III_Richardson_Extrapolation.docx
+++ b/Assignment-III/Assignment_III_Richardson_Extrapolation.docx
@@ -179,7 +179,15 @@
         <w:jc w:val="both"/>
       </w:pPr>
       <w:r>
-        <w:t>Two numerical differentiation methods are implemented: the Central Difference method, and Richardson Extrapolation built on top of it. Both methods are tested on four functions — eˣ, sin(x), cos(x), and x³ − 2x + 1 — at the evaluation point x = 1, across step sizes ranging from h = 10⁻¹ down to h = 10⁻¹², to study both convergence behaviour and the point at which floating-point round-off error begins to dominate.</w:t>
+        <w:t xml:space="preserve">Two numerical differentiation methods are implemented: the Central Difference method, and Richardson Extrapolation built on top of it. Both methods are tested on four functions — </w:t>
+      </w:r>
+      <w:proofErr w:type="spellStart"/>
+      <w:r>
+        <w:t>eˣ</w:t>
+      </w:r>
+      <w:proofErr w:type="spellEnd"/>
+      <w:r>
+        <w:t>, sin(x), cos(x), and x³ − 2x + 1 — at the evaluation point x = 1, across step sizes ranging from h = 10⁻¹ down to h = 10⁻¹², to study both convergence behaviour and the point at which floating-point round-off error begins to dominate.</w:t>
       </w:r>
     </w:p>
     <w:p>
@@ -221,7 +229,47 @@
         <w:spacing w:after="160" w:line="276" w:lineRule="auto"/>
       </w:pPr>
       <w:r>
-        <w:t>D(h) = [ f(x + h) − f(x − h) ] / (2h)     —  theoretical order O(h²)</w:t>
+        <w:t xml:space="preserve">D(h) = [ </w:t>
+      </w:r>
+      <w:proofErr w:type="gramStart"/>
+      <w:r>
+        <w:t>f(</w:t>
+      </w:r>
+      <w:proofErr w:type="gramEnd"/>
+      <w:r>
+        <w:t xml:space="preserve">x + h) − </w:t>
+      </w:r>
+      <w:proofErr w:type="gramStart"/>
+      <w:r>
+        <w:t>f(</w:t>
+      </w:r>
+      <w:proofErr w:type="gramEnd"/>
+      <w:r>
+        <w:t>x − h</w:t>
+      </w:r>
+      <w:proofErr w:type="gramStart"/>
+      <w:r>
+        <w:t>) ]</w:t>
+      </w:r>
+      <w:proofErr w:type="gramEnd"/>
+      <w:r>
+        <w:t xml:space="preserve"> / (2</w:t>
+      </w:r>
+      <w:proofErr w:type="gramStart"/>
+      <w:r>
+        <w:t xml:space="preserve">h)   </w:t>
+      </w:r>
+      <w:proofErr w:type="gramEnd"/>
+      <w:r>
+        <w:t xml:space="preserve">  </w:t>
+      </w:r>
+      <w:proofErr w:type="gramStart"/>
+      <w:r>
+        <w:t>—  theoretical</w:t>
+      </w:r>
+      <w:proofErr w:type="gramEnd"/>
+      <w:r>
+        <w:t xml:space="preserve"> order O(h²)</w:t>
       </w:r>
     </w:p>
     <w:p>
@@ -254,7 +302,23 @@
         <w:spacing w:after="160" w:line="276" w:lineRule="auto"/>
       </w:pPr>
       <w:r>
-        <w:t>R(h) = [ 4·D(h/2) − D(h) ] / 3     —  theoretical order O(h⁴)</w:t>
+        <w:t>R(h) = [ 4·D(h/2) − D(h</w:t>
+      </w:r>
+      <w:proofErr w:type="gramStart"/>
+      <w:r>
+        <w:t>) ]</w:t>
+      </w:r>
+      <w:proofErr w:type="gramEnd"/>
+      <w:r>
+        <w:t xml:space="preserve"> / 3     </w:t>
+      </w:r>
+      <w:proofErr w:type="gramStart"/>
+      <w:r>
+        <w:t>—  theoretical</w:t>
+      </w:r>
+      <w:proofErr w:type="gramEnd"/>
+      <w:r>
+        <w:t xml:space="preserve"> order O(h⁴)</w:t>
       </w:r>
     </w:p>
     <w:p>
@@ -295,12 +359,6 @@
         <w:gridCol w:w="10080"/>
       </w:tblGrid>
       <w:tr>
-        <w:tblPrEx>
-          <w:tblCellMar>
-            <w:top w:w="0" w:type="dxa"/>
-            <w:bottom w:w="0" w:type="dxa"/>
-          </w:tblCellMar>
-        </w:tblPrEx>
         <w:tc>
           <w:tcPr>
             <w:tcW w:w="10080" w:type="dxa"/>
@@ -367,33 +425,25 @@
                 <w:sz w:val="18"/>
                 <w:szCs w:val="18"/>
               </w:rPr>
-              <w:t>1. CentralDifference.compute(f, x, h):</w:t>
-            </w:r>
-          </w:p>
-          <w:p>
-            <w:pPr>
-              <w:spacing w:after="20"/>
-            </w:pPr>
+              <w:t xml:space="preserve">1. </w:t>
+            </w:r>
+            <w:proofErr w:type="spellStart"/>
             <w:r>
               <w:rPr>
                 <w:rFonts w:ascii="Consolas" w:eastAsia="Consolas" w:hAnsi="Consolas" w:cs="Consolas"/>
                 <w:sz w:val="18"/>
                 <w:szCs w:val="18"/>
               </w:rPr>
-              <w:t xml:space="preserve">       return ( f(x + h) - f(x - h) ) / (2 * h)</w:t>
-            </w:r>
-          </w:p>
-          <w:p>
-            <w:pPr>
-              <w:spacing w:after="20"/>
-            </w:pPr>
+              <w:t>CentralDifference.compute</w:t>
+            </w:r>
+            <w:proofErr w:type="spellEnd"/>
             <w:r>
               <w:rPr>
                 <w:rFonts w:ascii="Consolas" w:eastAsia="Consolas" w:hAnsi="Consolas" w:cs="Consolas"/>
                 <w:sz w:val="18"/>
                 <w:szCs w:val="18"/>
               </w:rPr>
-              <w:t xml:space="preserve"> </w:t>
+              <w:t>(f, x, h):</w:t>
             </w:r>
           </w:p>
           <w:p>
@@ -406,85 +456,61 @@
                 <w:sz w:val="18"/>
                 <w:szCs w:val="18"/>
               </w:rPr>
-              <w:t>2. RichardsonExtrapolation.compute(f, x, h):</w:t>
-            </w:r>
-          </w:p>
-          <w:p>
-            <w:pPr>
-              <w:spacing w:after="20"/>
-            </w:pPr>
+              <w:t xml:space="preserve">       return </w:t>
+            </w:r>
+            <w:proofErr w:type="gramStart"/>
             <w:r>
               <w:rPr>
                 <w:rFonts w:ascii="Consolas" w:eastAsia="Consolas" w:hAnsi="Consolas" w:cs="Consolas"/>
                 <w:sz w:val="18"/>
                 <w:szCs w:val="18"/>
               </w:rPr>
-              <w:t xml:space="preserve">       D_h      = CentralDifference.compute(f, x, h)</w:t>
-            </w:r>
-          </w:p>
-          <w:p>
-            <w:pPr>
-              <w:spacing w:after="20"/>
-            </w:pPr>
+              <w:t>( f</w:t>
+            </w:r>
+            <w:proofErr w:type="gramEnd"/>
             <w:r>
               <w:rPr>
                 <w:rFonts w:ascii="Consolas" w:eastAsia="Consolas" w:hAnsi="Consolas" w:cs="Consolas"/>
                 <w:sz w:val="18"/>
                 <w:szCs w:val="18"/>
               </w:rPr>
-              <w:t xml:space="preserve">       D_h_half = CentralDifference.compute(f, x, h / 2)</w:t>
-            </w:r>
-          </w:p>
-          <w:p>
-            <w:pPr>
-              <w:spacing w:after="20"/>
-            </w:pPr>
+              <w:t xml:space="preserve">(x + h) - </w:t>
+            </w:r>
+            <w:proofErr w:type="gramStart"/>
             <w:r>
               <w:rPr>
                 <w:rFonts w:ascii="Consolas" w:eastAsia="Consolas" w:hAnsi="Consolas" w:cs="Consolas"/>
                 <w:sz w:val="18"/>
                 <w:szCs w:val="18"/>
               </w:rPr>
-              <w:t xml:space="preserve">       return ( 4 * D_h_half - D_h ) / 3</w:t>
-            </w:r>
-          </w:p>
-          <w:p>
-            <w:pPr>
-              <w:spacing w:after="20"/>
-            </w:pPr>
+              <w:t>f(</w:t>
+            </w:r>
+            <w:proofErr w:type="gramEnd"/>
             <w:r>
               <w:rPr>
                 <w:rFonts w:ascii="Consolas" w:eastAsia="Consolas" w:hAnsi="Consolas" w:cs="Consolas"/>
                 <w:sz w:val="18"/>
                 <w:szCs w:val="18"/>
               </w:rPr>
-              <w:t xml:space="preserve"> </w:t>
-            </w:r>
-          </w:p>
-          <w:p>
-            <w:pPr>
-              <w:spacing w:after="20"/>
-            </w:pPr>
+              <w:t>x - h</w:t>
+            </w:r>
+            <w:proofErr w:type="gramStart"/>
             <w:r>
               <w:rPr>
                 <w:rFonts w:ascii="Consolas" w:eastAsia="Consolas" w:hAnsi="Consolas" w:cs="Consolas"/>
                 <w:sz w:val="18"/>
                 <w:szCs w:val="18"/>
               </w:rPr>
-              <w:t>3. Main experiment loop:</w:t>
-            </w:r>
-          </w:p>
-          <w:p>
-            <w:pPr>
-              <w:spacing w:after="20"/>
-            </w:pPr>
+              <w:t>) )</w:t>
+            </w:r>
+            <w:proofErr w:type="gramEnd"/>
             <w:r>
               <w:rPr>
                 <w:rFonts w:ascii="Consolas" w:eastAsia="Consolas" w:hAnsi="Consolas" w:cs="Consolas"/>
                 <w:sz w:val="18"/>
                 <w:szCs w:val="18"/>
               </w:rPr>
-              <w:t xml:space="preserve">       for each test function f in {e^x, sin(x), cos(x), x^3 - 2x + 1}:</w:t>
+              <w:t xml:space="preserve"> / (2 * h)</w:t>
             </w:r>
           </w:p>
           <w:p>
@@ -497,8 +523,7 @@
                 <w:sz w:val="18"/>
                 <w:szCs w:val="18"/>
               </w:rPr>
-              <w:lastRenderedPageBreak/>
-              <w:t xml:space="preserve">           exact = f.exact_derivative(x = 1)</w:t>
+              <w:t xml:space="preserve"> </w:t>
             </w:r>
           </w:p>
           <w:p>
@@ -511,33 +536,25 @@
                 <w:sz w:val="18"/>
                 <w:szCs w:val="18"/>
               </w:rPr>
-              <w:t xml:space="preserve">           for each h in [1e-1, 1e-2, ..., 1e-12]:</w:t>
-            </w:r>
-          </w:p>
-          <w:p>
-            <w:pPr>
-              <w:spacing w:after="20"/>
-            </w:pPr>
+              <w:t xml:space="preserve">2. </w:t>
+            </w:r>
+            <w:proofErr w:type="spellStart"/>
             <w:r>
               <w:rPr>
                 <w:rFonts w:ascii="Consolas" w:eastAsia="Consolas" w:hAnsi="Consolas" w:cs="Consolas"/>
                 <w:sz w:val="18"/>
                 <w:szCs w:val="18"/>
               </w:rPr>
-              <w:t xml:space="preserve">               D_h   = CentralDifference.compute(f, 1, h)</w:t>
-            </w:r>
-          </w:p>
-          <w:p>
-            <w:pPr>
-              <w:spacing w:after="20"/>
-            </w:pPr>
+              <w:t>RichardsonExtrapolation.compute</w:t>
+            </w:r>
+            <w:proofErr w:type="spellEnd"/>
             <w:r>
               <w:rPr>
                 <w:rFonts w:ascii="Consolas" w:eastAsia="Consolas" w:hAnsi="Consolas" w:cs="Consolas"/>
                 <w:sz w:val="18"/>
                 <w:szCs w:val="18"/>
               </w:rPr>
-              <w:t xml:space="preserve">               R_h   = RichardsonExtrapolation.compute(f, 1, h)</w:t>
+              <w:t>(f, x, h):</w:t>
             </w:r>
           </w:p>
           <w:p>
@@ -550,59 +567,43 @@
                 <w:sz w:val="18"/>
                 <w:szCs w:val="18"/>
               </w:rPr>
-              <w:t xml:space="preserve">               err_D = | exact - D_h |</w:t>
-            </w:r>
-          </w:p>
-          <w:p>
-            <w:pPr>
-              <w:spacing w:after="20"/>
-            </w:pPr>
+              <w:t xml:space="preserve">       </w:t>
+            </w:r>
+            <w:proofErr w:type="spellStart"/>
             <w:r>
               <w:rPr>
                 <w:rFonts w:ascii="Consolas" w:eastAsia="Consolas" w:hAnsi="Consolas" w:cs="Consolas"/>
                 <w:sz w:val="18"/>
                 <w:szCs w:val="18"/>
               </w:rPr>
-              <w:t xml:space="preserve">               err_R = | exact - R_h |</w:t>
-            </w:r>
-          </w:p>
-          <w:p>
-            <w:pPr>
-              <w:spacing w:after="20"/>
-            </w:pPr>
+              <w:t>D_h</w:t>
+            </w:r>
+            <w:proofErr w:type="spellEnd"/>
             <w:r>
               <w:rPr>
                 <w:rFonts w:ascii="Consolas" w:eastAsia="Consolas" w:hAnsi="Consolas" w:cs="Consolas"/>
                 <w:sz w:val="18"/>
                 <w:szCs w:val="18"/>
               </w:rPr>
-              <w:t xml:space="preserve">               store (f.name, h, D_h, R_h, exact, err_D, err_R)</w:t>
-            </w:r>
-          </w:p>
-          <w:p>
-            <w:pPr>
-              <w:spacing w:after="20"/>
-            </w:pPr>
+              <w:t xml:space="preserve">      = </w:t>
+            </w:r>
+            <w:proofErr w:type="spellStart"/>
             <w:r>
               <w:rPr>
                 <w:rFonts w:ascii="Consolas" w:eastAsia="Consolas" w:hAnsi="Consolas" w:cs="Consolas"/>
                 <w:sz w:val="18"/>
                 <w:szCs w:val="18"/>
               </w:rPr>
-              <w:t xml:space="preserve"> </w:t>
-            </w:r>
-          </w:p>
-          <w:p>
-            <w:pPr>
-              <w:spacing w:after="20"/>
-            </w:pPr>
+              <w:t>CentralDifference.compute</w:t>
+            </w:r>
+            <w:proofErr w:type="spellEnd"/>
             <w:r>
               <w:rPr>
                 <w:rFonts w:ascii="Consolas" w:eastAsia="Consolas" w:hAnsi="Consolas" w:cs="Consolas"/>
                 <w:sz w:val="18"/>
                 <w:szCs w:val="18"/>
               </w:rPr>
-              <w:t>4. Convergence slope estimation (log-log linear fit):</w:t>
+              <w:t>(f, x, h)</w:t>
             </w:r>
           </w:p>
           <w:p>
@@ -615,33 +616,25 @@
                 <w:sz w:val="18"/>
                 <w:szCs w:val="18"/>
               </w:rPr>
-              <w:t xml:space="preserve">       xs = log10(h)                 for every stored h</w:t>
-            </w:r>
-          </w:p>
-          <w:p>
-            <w:pPr>
-              <w:spacing w:after="20"/>
-            </w:pPr>
+              <w:t xml:space="preserve">       D_h_half = </w:t>
+            </w:r>
+            <w:proofErr w:type="spellStart"/>
             <w:r>
               <w:rPr>
                 <w:rFonts w:ascii="Consolas" w:eastAsia="Consolas" w:hAnsi="Consolas" w:cs="Consolas"/>
                 <w:sz w:val="18"/>
                 <w:szCs w:val="18"/>
               </w:rPr>
-              <w:t xml:space="preserve">       ys = log10(error)             for every stored error (error &gt; 0)</w:t>
-            </w:r>
-          </w:p>
-          <w:p>
-            <w:pPr>
-              <w:spacing w:after="20"/>
-            </w:pPr>
+              <w:t>CentralDifference.compute</w:t>
+            </w:r>
+            <w:proofErr w:type="spellEnd"/>
             <w:r>
               <w:rPr>
                 <w:rFonts w:ascii="Consolas" w:eastAsia="Consolas" w:hAnsi="Consolas" w:cs="Consolas"/>
                 <w:sz w:val="18"/>
                 <w:szCs w:val="18"/>
               </w:rPr>
-              <w:t xml:space="preserve">       slope = covariance(xs, ys) / variance(xs)      # least-squares fit</w:t>
+              <w:t>(f, x, h / 2)</w:t>
             </w:r>
           </w:p>
           <w:p>
@@ -654,85 +647,61 @@
                 <w:sz w:val="18"/>
                 <w:szCs w:val="18"/>
               </w:rPr>
-              <w:t xml:space="preserve"> </w:t>
-            </w:r>
-          </w:p>
-          <w:p>
-            <w:pPr>
-              <w:spacing w:after="20"/>
-            </w:pPr>
+              <w:t xml:space="preserve">       return </w:t>
+            </w:r>
+            <w:proofErr w:type="gramStart"/>
             <w:r>
               <w:rPr>
                 <w:rFonts w:ascii="Consolas" w:eastAsia="Consolas" w:hAnsi="Consolas" w:cs="Consolas"/>
                 <w:sz w:val="18"/>
                 <w:szCs w:val="18"/>
               </w:rPr>
-              <w:t>5. Output:</w:t>
-            </w:r>
-          </w:p>
-          <w:p>
-            <w:pPr>
-              <w:spacing w:after="20"/>
-            </w:pPr>
+              <w:t>( 4</w:t>
+            </w:r>
+            <w:proofErr w:type="gramEnd"/>
             <w:r>
               <w:rPr>
                 <w:rFonts w:ascii="Consolas" w:eastAsia="Consolas" w:hAnsi="Consolas" w:cs="Consolas"/>
                 <w:sz w:val="18"/>
                 <w:szCs w:val="18"/>
               </w:rPr>
-              <w:t xml:space="preserve">       - Save full results table to CSV (file_handler.save_results_csv)</w:t>
-            </w:r>
-          </w:p>
-          <w:p>
-            <w:pPr>
-              <w:spacing w:after="20"/>
-            </w:pPr>
+              <w:t xml:space="preserve"> * D_h_half - </w:t>
+            </w:r>
+            <w:proofErr w:type="spellStart"/>
             <w:r>
               <w:rPr>
                 <w:rFonts w:ascii="Consolas" w:eastAsia="Consolas" w:hAnsi="Consolas" w:cs="Consolas"/>
                 <w:sz w:val="18"/>
                 <w:szCs w:val="18"/>
               </w:rPr>
-              <w:t xml:space="preserve">       - Save convergence slopes to CSV (file_handler.save_slopes_csv)</w:t>
-            </w:r>
-          </w:p>
-          <w:p>
-            <w:pPr>
-              <w:spacing w:after="20"/>
-            </w:pPr>
+              <w:t>D_</w:t>
+            </w:r>
+            <w:proofErr w:type="gramStart"/>
             <w:r>
               <w:rPr>
                 <w:rFonts w:ascii="Consolas" w:eastAsia="Consolas" w:hAnsi="Consolas" w:cs="Consolas"/>
                 <w:sz w:val="18"/>
                 <w:szCs w:val="18"/>
               </w:rPr>
-              <w:t xml:space="preserve">       - Plot each function's curve (visualizer.plot_functions)</w:t>
-            </w:r>
-          </w:p>
-          <w:p>
-            <w:pPr>
-              <w:spacing w:after="20"/>
-            </w:pPr>
+              <w:t>h</w:t>
+            </w:r>
+            <w:proofErr w:type="spellEnd"/>
             <w:r>
               <w:rPr>
                 <w:rFonts w:ascii="Consolas" w:eastAsia="Consolas" w:hAnsi="Consolas" w:cs="Consolas"/>
                 <w:sz w:val="18"/>
                 <w:szCs w:val="18"/>
               </w:rPr>
-              <w:t xml:space="preserve">       - Plot log-log error vs h per function (visualizer.plot_convergence_loglog)</w:t>
-            </w:r>
-          </w:p>
-          <w:p>
-            <w:pPr>
-              <w:spacing w:after="20"/>
-            </w:pPr>
+              <w:t xml:space="preserve"> )</w:t>
+            </w:r>
+            <w:proofErr w:type="gramEnd"/>
             <w:r>
               <w:rPr>
                 <w:rFonts w:ascii="Consolas" w:eastAsia="Consolas" w:hAnsi="Consolas" w:cs="Consolas"/>
                 <w:sz w:val="18"/>
                 <w:szCs w:val="18"/>
               </w:rPr>
-              <w:t xml:space="preserve">       - Plot a combined overview of all functions (visualizer.plot_all_convergence_overview)</w:t>
+              <w:t xml:space="preserve"> / 3</w:t>
             </w:r>
           </w:p>
           <w:p>
@@ -745,7 +714,912 @@
                 <w:sz w:val="18"/>
                 <w:szCs w:val="18"/>
               </w:rPr>
-              <w:t xml:space="preserve">       - Write text report with answers to Q1-Q6 (file_handler.save_text_report)</w:t>
+              <w:t xml:space="preserve"> </w:t>
+            </w:r>
+          </w:p>
+          <w:p>
+            <w:pPr>
+              <w:spacing w:after="20"/>
+            </w:pPr>
+            <w:r>
+              <w:rPr>
+                <w:rFonts w:ascii="Consolas" w:eastAsia="Consolas" w:hAnsi="Consolas" w:cs="Consolas"/>
+                <w:sz w:val="18"/>
+                <w:szCs w:val="18"/>
+              </w:rPr>
+              <w:t>3. Main experiment loop:</w:t>
+            </w:r>
+          </w:p>
+          <w:p>
+            <w:pPr>
+              <w:spacing w:after="20"/>
+            </w:pPr>
+            <w:r>
+              <w:rPr>
+                <w:rFonts w:ascii="Consolas" w:eastAsia="Consolas" w:hAnsi="Consolas" w:cs="Consolas"/>
+                <w:sz w:val="18"/>
+                <w:szCs w:val="18"/>
+              </w:rPr>
+              <w:t xml:space="preserve">       for each test function f in {</w:t>
+            </w:r>
+            <w:proofErr w:type="spellStart"/>
+            <w:r>
+              <w:rPr>
+                <w:rFonts w:ascii="Consolas" w:eastAsia="Consolas" w:hAnsi="Consolas" w:cs="Consolas"/>
+                <w:sz w:val="18"/>
+                <w:szCs w:val="18"/>
+              </w:rPr>
+              <w:t>e^x</w:t>
+            </w:r>
+            <w:proofErr w:type="spellEnd"/>
+            <w:r>
+              <w:rPr>
+                <w:rFonts w:ascii="Consolas" w:eastAsia="Consolas" w:hAnsi="Consolas" w:cs="Consolas"/>
+                <w:sz w:val="18"/>
+                <w:szCs w:val="18"/>
+              </w:rPr>
+              <w:t>, sin(x), cos(x), x^3 - 2x + 1}:</w:t>
+            </w:r>
+          </w:p>
+          <w:p>
+            <w:pPr>
+              <w:spacing w:after="20"/>
+            </w:pPr>
+            <w:r>
+              <w:rPr>
+                <w:rFonts w:ascii="Consolas" w:eastAsia="Consolas" w:hAnsi="Consolas" w:cs="Consolas"/>
+                <w:sz w:val="18"/>
+                <w:szCs w:val="18"/>
+              </w:rPr>
+              <w:lastRenderedPageBreak/>
+              <w:t xml:space="preserve">           exact = </w:t>
+            </w:r>
+            <w:proofErr w:type="spellStart"/>
+            <w:proofErr w:type="gramStart"/>
+            <w:r>
+              <w:rPr>
+                <w:rFonts w:ascii="Consolas" w:eastAsia="Consolas" w:hAnsi="Consolas" w:cs="Consolas"/>
+                <w:sz w:val="18"/>
+                <w:szCs w:val="18"/>
+              </w:rPr>
+              <w:t>f.exact</w:t>
+            </w:r>
+            <w:proofErr w:type="gramEnd"/>
+            <w:r>
+              <w:rPr>
+                <w:rFonts w:ascii="Consolas" w:eastAsia="Consolas" w:hAnsi="Consolas" w:cs="Consolas"/>
+                <w:sz w:val="18"/>
+                <w:szCs w:val="18"/>
+              </w:rPr>
+              <w:t>_</w:t>
+            </w:r>
+            <w:proofErr w:type="gramStart"/>
+            <w:r>
+              <w:rPr>
+                <w:rFonts w:ascii="Consolas" w:eastAsia="Consolas" w:hAnsi="Consolas" w:cs="Consolas"/>
+                <w:sz w:val="18"/>
+                <w:szCs w:val="18"/>
+              </w:rPr>
+              <w:t>derivative</w:t>
+            </w:r>
+            <w:proofErr w:type="spellEnd"/>
+            <w:r>
+              <w:rPr>
+                <w:rFonts w:ascii="Consolas" w:eastAsia="Consolas" w:hAnsi="Consolas" w:cs="Consolas"/>
+                <w:sz w:val="18"/>
+                <w:szCs w:val="18"/>
+              </w:rPr>
+              <w:t>(</w:t>
+            </w:r>
+            <w:proofErr w:type="gramEnd"/>
+            <w:r>
+              <w:rPr>
+                <w:rFonts w:ascii="Consolas" w:eastAsia="Consolas" w:hAnsi="Consolas" w:cs="Consolas"/>
+                <w:sz w:val="18"/>
+                <w:szCs w:val="18"/>
+              </w:rPr>
+              <w:t>x = 1)</w:t>
+            </w:r>
+          </w:p>
+          <w:p>
+            <w:pPr>
+              <w:spacing w:after="20"/>
+            </w:pPr>
+            <w:r>
+              <w:rPr>
+                <w:rFonts w:ascii="Consolas" w:eastAsia="Consolas" w:hAnsi="Consolas" w:cs="Consolas"/>
+                <w:sz w:val="18"/>
+                <w:szCs w:val="18"/>
+              </w:rPr>
+              <w:t xml:space="preserve">           for each h in [1e-1, 1e-2, ..., 1e-12]:</w:t>
+            </w:r>
+          </w:p>
+          <w:p>
+            <w:pPr>
+              <w:spacing w:after="20"/>
+            </w:pPr>
+            <w:r>
+              <w:rPr>
+                <w:rFonts w:ascii="Consolas" w:eastAsia="Consolas" w:hAnsi="Consolas" w:cs="Consolas"/>
+                <w:sz w:val="18"/>
+                <w:szCs w:val="18"/>
+              </w:rPr>
+              <w:t xml:space="preserve">               </w:t>
+            </w:r>
+            <w:proofErr w:type="spellStart"/>
+            <w:r>
+              <w:rPr>
+                <w:rFonts w:ascii="Consolas" w:eastAsia="Consolas" w:hAnsi="Consolas" w:cs="Consolas"/>
+                <w:sz w:val="18"/>
+                <w:szCs w:val="18"/>
+              </w:rPr>
+              <w:t>D_h</w:t>
+            </w:r>
+            <w:proofErr w:type="spellEnd"/>
+            <w:r>
+              <w:rPr>
+                <w:rFonts w:ascii="Consolas" w:eastAsia="Consolas" w:hAnsi="Consolas" w:cs="Consolas"/>
+                <w:sz w:val="18"/>
+                <w:szCs w:val="18"/>
+              </w:rPr>
+              <w:t xml:space="preserve">   = </w:t>
+            </w:r>
+            <w:proofErr w:type="spellStart"/>
+            <w:r>
+              <w:rPr>
+                <w:rFonts w:ascii="Consolas" w:eastAsia="Consolas" w:hAnsi="Consolas" w:cs="Consolas"/>
+                <w:sz w:val="18"/>
+                <w:szCs w:val="18"/>
+              </w:rPr>
+              <w:t>CentralDifference.compute</w:t>
+            </w:r>
+            <w:proofErr w:type="spellEnd"/>
+            <w:r>
+              <w:rPr>
+                <w:rFonts w:ascii="Consolas" w:eastAsia="Consolas" w:hAnsi="Consolas" w:cs="Consolas"/>
+                <w:sz w:val="18"/>
+                <w:szCs w:val="18"/>
+              </w:rPr>
+              <w:t>(f, 1, h)</w:t>
+            </w:r>
+          </w:p>
+          <w:p>
+            <w:pPr>
+              <w:spacing w:after="20"/>
+            </w:pPr>
+            <w:r>
+              <w:rPr>
+                <w:rFonts w:ascii="Consolas" w:eastAsia="Consolas" w:hAnsi="Consolas" w:cs="Consolas"/>
+                <w:sz w:val="18"/>
+                <w:szCs w:val="18"/>
+              </w:rPr>
+              <w:t xml:space="preserve">               </w:t>
+            </w:r>
+            <w:proofErr w:type="spellStart"/>
+            <w:r>
+              <w:rPr>
+                <w:rFonts w:ascii="Consolas" w:eastAsia="Consolas" w:hAnsi="Consolas" w:cs="Consolas"/>
+                <w:sz w:val="18"/>
+                <w:szCs w:val="18"/>
+              </w:rPr>
+              <w:t>R_h</w:t>
+            </w:r>
+            <w:proofErr w:type="spellEnd"/>
+            <w:r>
+              <w:rPr>
+                <w:rFonts w:ascii="Consolas" w:eastAsia="Consolas" w:hAnsi="Consolas" w:cs="Consolas"/>
+                <w:sz w:val="18"/>
+                <w:szCs w:val="18"/>
+              </w:rPr>
+              <w:t xml:space="preserve">   = </w:t>
+            </w:r>
+            <w:proofErr w:type="spellStart"/>
+            <w:r>
+              <w:rPr>
+                <w:rFonts w:ascii="Consolas" w:eastAsia="Consolas" w:hAnsi="Consolas" w:cs="Consolas"/>
+                <w:sz w:val="18"/>
+                <w:szCs w:val="18"/>
+              </w:rPr>
+              <w:t>RichardsonExtrapolation.compute</w:t>
+            </w:r>
+            <w:proofErr w:type="spellEnd"/>
+            <w:r>
+              <w:rPr>
+                <w:rFonts w:ascii="Consolas" w:eastAsia="Consolas" w:hAnsi="Consolas" w:cs="Consolas"/>
+                <w:sz w:val="18"/>
+                <w:szCs w:val="18"/>
+              </w:rPr>
+              <w:t>(f, 1, h)</w:t>
+            </w:r>
+          </w:p>
+          <w:p>
+            <w:pPr>
+              <w:spacing w:after="20"/>
+            </w:pPr>
+            <w:r>
+              <w:rPr>
+                <w:rFonts w:ascii="Consolas" w:eastAsia="Consolas" w:hAnsi="Consolas" w:cs="Consolas"/>
+                <w:sz w:val="18"/>
+                <w:szCs w:val="18"/>
+              </w:rPr>
+              <w:t xml:space="preserve">               </w:t>
+            </w:r>
+            <w:proofErr w:type="spellStart"/>
+            <w:r>
+              <w:rPr>
+                <w:rFonts w:ascii="Consolas" w:eastAsia="Consolas" w:hAnsi="Consolas" w:cs="Consolas"/>
+                <w:sz w:val="18"/>
+                <w:szCs w:val="18"/>
+              </w:rPr>
+              <w:t>err_D</w:t>
+            </w:r>
+            <w:proofErr w:type="spellEnd"/>
+            <w:r>
+              <w:rPr>
+                <w:rFonts w:ascii="Consolas" w:eastAsia="Consolas" w:hAnsi="Consolas" w:cs="Consolas"/>
+                <w:sz w:val="18"/>
+                <w:szCs w:val="18"/>
+              </w:rPr>
+              <w:t xml:space="preserve"> = | exact - </w:t>
+            </w:r>
+            <w:proofErr w:type="spellStart"/>
+            <w:r>
+              <w:rPr>
+                <w:rFonts w:ascii="Consolas" w:eastAsia="Consolas" w:hAnsi="Consolas" w:cs="Consolas"/>
+                <w:sz w:val="18"/>
+                <w:szCs w:val="18"/>
+              </w:rPr>
+              <w:t>D_h</w:t>
+            </w:r>
+            <w:proofErr w:type="spellEnd"/>
+            <w:r>
+              <w:rPr>
+                <w:rFonts w:ascii="Consolas" w:eastAsia="Consolas" w:hAnsi="Consolas" w:cs="Consolas"/>
+                <w:sz w:val="18"/>
+                <w:szCs w:val="18"/>
+              </w:rPr>
+              <w:t xml:space="preserve"> |</w:t>
+            </w:r>
+          </w:p>
+          <w:p>
+            <w:pPr>
+              <w:spacing w:after="20"/>
+            </w:pPr>
+            <w:r>
+              <w:rPr>
+                <w:rFonts w:ascii="Consolas" w:eastAsia="Consolas" w:hAnsi="Consolas" w:cs="Consolas"/>
+                <w:sz w:val="18"/>
+                <w:szCs w:val="18"/>
+              </w:rPr>
+              <w:t xml:space="preserve">               </w:t>
+            </w:r>
+            <w:proofErr w:type="spellStart"/>
+            <w:r>
+              <w:rPr>
+                <w:rFonts w:ascii="Consolas" w:eastAsia="Consolas" w:hAnsi="Consolas" w:cs="Consolas"/>
+                <w:sz w:val="18"/>
+                <w:szCs w:val="18"/>
+              </w:rPr>
+              <w:t>err_R</w:t>
+            </w:r>
+            <w:proofErr w:type="spellEnd"/>
+            <w:r>
+              <w:rPr>
+                <w:rFonts w:ascii="Consolas" w:eastAsia="Consolas" w:hAnsi="Consolas" w:cs="Consolas"/>
+                <w:sz w:val="18"/>
+                <w:szCs w:val="18"/>
+              </w:rPr>
+              <w:t xml:space="preserve"> = | exact - </w:t>
+            </w:r>
+            <w:proofErr w:type="spellStart"/>
+            <w:r>
+              <w:rPr>
+                <w:rFonts w:ascii="Consolas" w:eastAsia="Consolas" w:hAnsi="Consolas" w:cs="Consolas"/>
+                <w:sz w:val="18"/>
+                <w:szCs w:val="18"/>
+              </w:rPr>
+              <w:t>R_h</w:t>
+            </w:r>
+            <w:proofErr w:type="spellEnd"/>
+            <w:r>
+              <w:rPr>
+                <w:rFonts w:ascii="Consolas" w:eastAsia="Consolas" w:hAnsi="Consolas" w:cs="Consolas"/>
+                <w:sz w:val="18"/>
+                <w:szCs w:val="18"/>
+              </w:rPr>
+              <w:t xml:space="preserve"> |</w:t>
+            </w:r>
+          </w:p>
+          <w:p>
+            <w:pPr>
+              <w:spacing w:after="20"/>
+            </w:pPr>
+            <w:r>
+              <w:rPr>
+                <w:rFonts w:ascii="Consolas" w:eastAsia="Consolas" w:hAnsi="Consolas" w:cs="Consolas"/>
+                <w:sz w:val="18"/>
+                <w:szCs w:val="18"/>
+              </w:rPr>
+              <w:t xml:space="preserve">               store (f.name, h, </w:t>
+            </w:r>
+            <w:proofErr w:type="spellStart"/>
+            <w:r>
+              <w:rPr>
+                <w:rFonts w:ascii="Consolas" w:eastAsia="Consolas" w:hAnsi="Consolas" w:cs="Consolas"/>
+                <w:sz w:val="18"/>
+                <w:szCs w:val="18"/>
+              </w:rPr>
+              <w:t>D_h</w:t>
+            </w:r>
+            <w:proofErr w:type="spellEnd"/>
+            <w:r>
+              <w:rPr>
+                <w:rFonts w:ascii="Consolas" w:eastAsia="Consolas" w:hAnsi="Consolas" w:cs="Consolas"/>
+                <w:sz w:val="18"/>
+                <w:szCs w:val="18"/>
+              </w:rPr>
+              <w:t xml:space="preserve">, </w:t>
+            </w:r>
+            <w:proofErr w:type="spellStart"/>
+            <w:r>
+              <w:rPr>
+                <w:rFonts w:ascii="Consolas" w:eastAsia="Consolas" w:hAnsi="Consolas" w:cs="Consolas"/>
+                <w:sz w:val="18"/>
+                <w:szCs w:val="18"/>
+              </w:rPr>
+              <w:t>R_h</w:t>
+            </w:r>
+            <w:proofErr w:type="spellEnd"/>
+            <w:r>
+              <w:rPr>
+                <w:rFonts w:ascii="Consolas" w:eastAsia="Consolas" w:hAnsi="Consolas" w:cs="Consolas"/>
+                <w:sz w:val="18"/>
+                <w:szCs w:val="18"/>
+              </w:rPr>
+              <w:t xml:space="preserve">, exact, </w:t>
+            </w:r>
+            <w:proofErr w:type="spellStart"/>
+            <w:r>
+              <w:rPr>
+                <w:rFonts w:ascii="Consolas" w:eastAsia="Consolas" w:hAnsi="Consolas" w:cs="Consolas"/>
+                <w:sz w:val="18"/>
+                <w:szCs w:val="18"/>
+              </w:rPr>
+              <w:t>err_D</w:t>
+            </w:r>
+            <w:proofErr w:type="spellEnd"/>
+            <w:r>
+              <w:rPr>
+                <w:rFonts w:ascii="Consolas" w:eastAsia="Consolas" w:hAnsi="Consolas" w:cs="Consolas"/>
+                <w:sz w:val="18"/>
+                <w:szCs w:val="18"/>
+              </w:rPr>
+              <w:t xml:space="preserve">, </w:t>
+            </w:r>
+            <w:proofErr w:type="spellStart"/>
+            <w:r>
+              <w:rPr>
+                <w:rFonts w:ascii="Consolas" w:eastAsia="Consolas" w:hAnsi="Consolas" w:cs="Consolas"/>
+                <w:sz w:val="18"/>
+                <w:szCs w:val="18"/>
+              </w:rPr>
+              <w:t>err_R</w:t>
+            </w:r>
+            <w:proofErr w:type="spellEnd"/>
+            <w:r>
+              <w:rPr>
+                <w:rFonts w:ascii="Consolas" w:eastAsia="Consolas" w:hAnsi="Consolas" w:cs="Consolas"/>
+                <w:sz w:val="18"/>
+                <w:szCs w:val="18"/>
+              </w:rPr>
+              <w:t>)</w:t>
+            </w:r>
+          </w:p>
+          <w:p>
+            <w:pPr>
+              <w:spacing w:after="20"/>
+            </w:pPr>
+            <w:r>
+              <w:rPr>
+                <w:rFonts w:ascii="Consolas" w:eastAsia="Consolas" w:hAnsi="Consolas" w:cs="Consolas"/>
+                <w:sz w:val="18"/>
+                <w:szCs w:val="18"/>
+              </w:rPr>
+              <w:t xml:space="preserve"> </w:t>
+            </w:r>
+          </w:p>
+          <w:p>
+            <w:pPr>
+              <w:spacing w:after="20"/>
+            </w:pPr>
+            <w:r>
+              <w:rPr>
+                <w:rFonts w:ascii="Consolas" w:eastAsia="Consolas" w:hAnsi="Consolas" w:cs="Consolas"/>
+                <w:sz w:val="18"/>
+                <w:szCs w:val="18"/>
+              </w:rPr>
+              <w:t>4. Convergence slope estimation (log-log linear fit):</w:t>
+            </w:r>
+          </w:p>
+          <w:p>
+            <w:pPr>
+              <w:spacing w:after="20"/>
+            </w:pPr>
+            <w:r>
+              <w:rPr>
+                <w:rFonts w:ascii="Consolas" w:eastAsia="Consolas" w:hAnsi="Consolas" w:cs="Consolas"/>
+                <w:sz w:val="18"/>
+                <w:szCs w:val="18"/>
+              </w:rPr>
+              <w:t xml:space="preserve">       </w:t>
+            </w:r>
+            <w:proofErr w:type="spellStart"/>
+            <w:r>
+              <w:rPr>
+                <w:rFonts w:ascii="Consolas" w:eastAsia="Consolas" w:hAnsi="Consolas" w:cs="Consolas"/>
+                <w:sz w:val="18"/>
+                <w:szCs w:val="18"/>
+              </w:rPr>
+              <w:t>xs</w:t>
+            </w:r>
+            <w:proofErr w:type="spellEnd"/>
+            <w:r>
+              <w:rPr>
+                <w:rFonts w:ascii="Consolas" w:eastAsia="Consolas" w:hAnsi="Consolas" w:cs="Consolas"/>
+                <w:sz w:val="18"/>
+                <w:szCs w:val="18"/>
+              </w:rPr>
+              <w:t xml:space="preserve"> = log10(</w:t>
+            </w:r>
+            <w:proofErr w:type="gramStart"/>
+            <w:r>
+              <w:rPr>
+                <w:rFonts w:ascii="Consolas" w:eastAsia="Consolas" w:hAnsi="Consolas" w:cs="Consolas"/>
+                <w:sz w:val="18"/>
+                <w:szCs w:val="18"/>
+              </w:rPr>
+              <w:t xml:space="preserve">h)   </w:t>
+            </w:r>
+            <w:proofErr w:type="gramEnd"/>
+            <w:r>
+              <w:rPr>
+                <w:rFonts w:ascii="Consolas" w:eastAsia="Consolas" w:hAnsi="Consolas" w:cs="Consolas"/>
+                <w:sz w:val="18"/>
+                <w:szCs w:val="18"/>
+              </w:rPr>
+              <w:t xml:space="preserve">              for every stored h</w:t>
+            </w:r>
+          </w:p>
+          <w:p>
+            <w:pPr>
+              <w:spacing w:after="20"/>
+            </w:pPr>
+            <w:r>
+              <w:rPr>
+                <w:rFonts w:ascii="Consolas" w:eastAsia="Consolas" w:hAnsi="Consolas" w:cs="Consolas"/>
+                <w:sz w:val="18"/>
+                <w:szCs w:val="18"/>
+              </w:rPr>
+              <w:t xml:space="preserve">       </w:t>
+            </w:r>
+            <w:proofErr w:type="spellStart"/>
+            <w:r>
+              <w:rPr>
+                <w:rFonts w:ascii="Consolas" w:eastAsia="Consolas" w:hAnsi="Consolas" w:cs="Consolas"/>
+                <w:sz w:val="18"/>
+                <w:szCs w:val="18"/>
+              </w:rPr>
+              <w:t>ys</w:t>
+            </w:r>
+            <w:proofErr w:type="spellEnd"/>
+            <w:r>
+              <w:rPr>
+                <w:rFonts w:ascii="Consolas" w:eastAsia="Consolas" w:hAnsi="Consolas" w:cs="Consolas"/>
+                <w:sz w:val="18"/>
+                <w:szCs w:val="18"/>
+              </w:rPr>
+              <w:t xml:space="preserve"> = log10(</w:t>
+            </w:r>
+            <w:proofErr w:type="gramStart"/>
+            <w:r>
+              <w:rPr>
+                <w:rFonts w:ascii="Consolas" w:eastAsia="Consolas" w:hAnsi="Consolas" w:cs="Consolas"/>
+                <w:sz w:val="18"/>
+                <w:szCs w:val="18"/>
+              </w:rPr>
+              <w:t xml:space="preserve">error)   </w:t>
+            </w:r>
+            <w:proofErr w:type="gramEnd"/>
+            <w:r>
+              <w:rPr>
+                <w:rFonts w:ascii="Consolas" w:eastAsia="Consolas" w:hAnsi="Consolas" w:cs="Consolas"/>
+                <w:sz w:val="18"/>
+                <w:szCs w:val="18"/>
+              </w:rPr>
+              <w:t xml:space="preserve">          for every stored error (error &gt; 0)</w:t>
+            </w:r>
+          </w:p>
+          <w:p>
+            <w:pPr>
+              <w:spacing w:after="20"/>
+            </w:pPr>
+            <w:r>
+              <w:rPr>
+                <w:rFonts w:ascii="Consolas" w:eastAsia="Consolas" w:hAnsi="Consolas" w:cs="Consolas"/>
+                <w:sz w:val="18"/>
+                <w:szCs w:val="18"/>
+              </w:rPr>
+              <w:t xml:space="preserve">       slope = </w:t>
+            </w:r>
+            <w:proofErr w:type="gramStart"/>
+            <w:r>
+              <w:rPr>
+                <w:rFonts w:ascii="Consolas" w:eastAsia="Consolas" w:hAnsi="Consolas" w:cs="Consolas"/>
+                <w:sz w:val="18"/>
+                <w:szCs w:val="18"/>
+              </w:rPr>
+              <w:t>covariance(</w:t>
+            </w:r>
+            <w:proofErr w:type="spellStart"/>
+            <w:proofErr w:type="gramEnd"/>
+            <w:r>
+              <w:rPr>
+                <w:rFonts w:ascii="Consolas" w:eastAsia="Consolas" w:hAnsi="Consolas" w:cs="Consolas"/>
+                <w:sz w:val="18"/>
+                <w:szCs w:val="18"/>
+              </w:rPr>
+              <w:t>xs</w:t>
+            </w:r>
+            <w:proofErr w:type="spellEnd"/>
+            <w:r>
+              <w:rPr>
+                <w:rFonts w:ascii="Consolas" w:eastAsia="Consolas" w:hAnsi="Consolas" w:cs="Consolas"/>
+                <w:sz w:val="18"/>
+                <w:szCs w:val="18"/>
+              </w:rPr>
+              <w:t xml:space="preserve">, </w:t>
+            </w:r>
+            <w:proofErr w:type="spellStart"/>
+            <w:r>
+              <w:rPr>
+                <w:rFonts w:ascii="Consolas" w:eastAsia="Consolas" w:hAnsi="Consolas" w:cs="Consolas"/>
+                <w:sz w:val="18"/>
+                <w:szCs w:val="18"/>
+              </w:rPr>
+              <w:t>ys</w:t>
+            </w:r>
+            <w:proofErr w:type="spellEnd"/>
+            <w:r>
+              <w:rPr>
+                <w:rFonts w:ascii="Consolas" w:eastAsia="Consolas" w:hAnsi="Consolas" w:cs="Consolas"/>
+                <w:sz w:val="18"/>
+                <w:szCs w:val="18"/>
+              </w:rPr>
+              <w:t>) / variance(</w:t>
+            </w:r>
+            <w:proofErr w:type="spellStart"/>
+            <w:proofErr w:type="gramStart"/>
+            <w:r>
+              <w:rPr>
+                <w:rFonts w:ascii="Consolas" w:eastAsia="Consolas" w:hAnsi="Consolas" w:cs="Consolas"/>
+                <w:sz w:val="18"/>
+                <w:szCs w:val="18"/>
+              </w:rPr>
+              <w:t>xs</w:t>
+            </w:r>
+            <w:proofErr w:type="spellEnd"/>
+            <w:r>
+              <w:rPr>
+                <w:rFonts w:ascii="Consolas" w:eastAsia="Consolas" w:hAnsi="Consolas" w:cs="Consolas"/>
+                <w:sz w:val="18"/>
+                <w:szCs w:val="18"/>
+              </w:rPr>
+              <w:t xml:space="preserve">)   </w:t>
+            </w:r>
+            <w:proofErr w:type="gramEnd"/>
+            <w:r>
+              <w:rPr>
+                <w:rFonts w:ascii="Consolas" w:eastAsia="Consolas" w:hAnsi="Consolas" w:cs="Consolas"/>
+                <w:sz w:val="18"/>
+                <w:szCs w:val="18"/>
+              </w:rPr>
+              <w:t xml:space="preserve">   # least-squares fit</w:t>
+            </w:r>
+          </w:p>
+          <w:p>
+            <w:pPr>
+              <w:spacing w:after="20"/>
+            </w:pPr>
+            <w:r>
+              <w:rPr>
+                <w:rFonts w:ascii="Consolas" w:eastAsia="Consolas" w:hAnsi="Consolas" w:cs="Consolas"/>
+                <w:sz w:val="18"/>
+                <w:szCs w:val="18"/>
+              </w:rPr>
+              <w:t xml:space="preserve"> </w:t>
+            </w:r>
+          </w:p>
+          <w:p>
+            <w:pPr>
+              <w:spacing w:after="20"/>
+            </w:pPr>
+            <w:r>
+              <w:rPr>
+                <w:rFonts w:ascii="Consolas" w:eastAsia="Consolas" w:hAnsi="Consolas" w:cs="Consolas"/>
+                <w:sz w:val="18"/>
+                <w:szCs w:val="18"/>
+              </w:rPr>
+              <w:t>5. Output:</w:t>
+            </w:r>
+          </w:p>
+          <w:p>
+            <w:pPr>
+              <w:spacing w:after="20"/>
+            </w:pPr>
+            <w:r>
+              <w:rPr>
+                <w:rFonts w:ascii="Consolas" w:eastAsia="Consolas" w:hAnsi="Consolas" w:cs="Consolas"/>
+                <w:sz w:val="18"/>
+                <w:szCs w:val="18"/>
+              </w:rPr>
+              <w:t xml:space="preserve">       - Save full results table to CSV (</w:t>
+            </w:r>
+            <w:proofErr w:type="spellStart"/>
+            <w:r>
+              <w:rPr>
+                <w:rFonts w:ascii="Consolas" w:eastAsia="Consolas" w:hAnsi="Consolas" w:cs="Consolas"/>
+                <w:sz w:val="18"/>
+                <w:szCs w:val="18"/>
+              </w:rPr>
+              <w:t>file_</w:t>
+            </w:r>
+            <w:proofErr w:type="gramStart"/>
+            <w:r>
+              <w:rPr>
+                <w:rFonts w:ascii="Consolas" w:eastAsia="Consolas" w:hAnsi="Consolas" w:cs="Consolas"/>
+                <w:sz w:val="18"/>
+                <w:szCs w:val="18"/>
+              </w:rPr>
+              <w:t>handler.save</w:t>
+            </w:r>
+            <w:proofErr w:type="gramEnd"/>
+            <w:r>
+              <w:rPr>
+                <w:rFonts w:ascii="Consolas" w:eastAsia="Consolas" w:hAnsi="Consolas" w:cs="Consolas"/>
+                <w:sz w:val="18"/>
+                <w:szCs w:val="18"/>
+              </w:rPr>
+              <w:t>_results_csv</w:t>
+            </w:r>
+            <w:proofErr w:type="spellEnd"/>
+            <w:r>
+              <w:rPr>
+                <w:rFonts w:ascii="Consolas" w:eastAsia="Consolas" w:hAnsi="Consolas" w:cs="Consolas"/>
+                <w:sz w:val="18"/>
+                <w:szCs w:val="18"/>
+              </w:rPr>
+              <w:t>)</w:t>
+            </w:r>
+          </w:p>
+          <w:p>
+            <w:pPr>
+              <w:spacing w:after="20"/>
+            </w:pPr>
+            <w:r>
+              <w:rPr>
+                <w:rFonts w:ascii="Consolas" w:eastAsia="Consolas" w:hAnsi="Consolas" w:cs="Consolas"/>
+                <w:sz w:val="18"/>
+                <w:szCs w:val="18"/>
+              </w:rPr>
+              <w:t xml:space="preserve">       - Save convergence slopes to CSV (</w:t>
+            </w:r>
+            <w:proofErr w:type="spellStart"/>
+            <w:r>
+              <w:rPr>
+                <w:rFonts w:ascii="Consolas" w:eastAsia="Consolas" w:hAnsi="Consolas" w:cs="Consolas"/>
+                <w:sz w:val="18"/>
+                <w:szCs w:val="18"/>
+              </w:rPr>
+              <w:t>file_</w:t>
+            </w:r>
+            <w:proofErr w:type="gramStart"/>
+            <w:r>
+              <w:rPr>
+                <w:rFonts w:ascii="Consolas" w:eastAsia="Consolas" w:hAnsi="Consolas" w:cs="Consolas"/>
+                <w:sz w:val="18"/>
+                <w:szCs w:val="18"/>
+              </w:rPr>
+              <w:t>handler.save</w:t>
+            </w:r>
+            <w:proofErr w:type="gramEnd"/>
+            <w:r>
+              <w:rPr>
+                <w:rFonts w:ascii="Consolas" w:eastAsia="Consolas" w:hAnsi="Consolas" w:cs="Consolas"/>
+                <w:sz w:val="18"/>
+                <w:szCs w:val="18"/>
+              </w:rPr>
+              <w:t>_slopes_csv</w:t>
+            </w:r>
+            <w:proofErr w:type="spellEnd"/>
+            <w:r>
+              <w:rPr>
+                <w:rFonts w:ascii="Consolas" w:eastAsia="Consolas" w:hAnsi="Consolas" w:cs="Consolas"/>
+                <w:sz w:val="18"/>
+                <w:szCs w:val="18"/>
+              </w:rPr>
+              <w:t>)</w:t>
+            </w:r>
+          </w:p>
+          <w:p>
+            <w:pPr>
+              <w:spacing w:after="20"/>
+            </w:pPr>
+            <w:r>
+              <w:rPr>
+                <w:rFonts w:ascii="Consolas" w:eastAsia="Consolas" w:hAnsi="Consolas" w:cs="Consolas"/>
+                <w:sz w:val="18"/>
+                <w:szCs w:val="18"/>
+              </w:rPr>
+              <w:t xml:space="preserve">       - Plot each function's curve (</w:t>
+            </w:r>
+            <w:proofErr w:type="spellStart"/>
+            <w:proofErr w:type="gramStart"/>
+            <w:r>
+              <w:rPr>
+                <w:rFonts w:ascii="Consolas" w:eastAsia="Consolas" w:hAnsi="Consolas" w:cs="Consolas"/>
+                <w:sz w:val="18"/>
+                <w:szCs w:val="18"/>
+              </w:rPr>
+              <w:t>visualizer.plot</w:t>
+            </w:r>
+            <w:proofErr w:type="gramEnd"/>
+            <w:r>
+              <w:rPr>
+                <w:rFonts w:ascii="Consolas" w:eastAsia="Consolas" w:hAnsi="Consolas" w:cs="Consolas"/>
+                <w:sz w:val="18"/>
+                <w:szCs w:val="18"/>
+              </w:rPr>
+              <w:t>_functions</w:t>
+            </w:r>
+            <w:proofErr w:type="spellEnd"/>
+            <w:r>
+              <w:rPr>
+                <w:rFonts w:ascii="Consolas" w:eastAsia="Consolas" w:hAnsi="Consolas" w:cs="Consolas"/>
+                <w:sz w:val="18"/>
+                <w:szCs w:val="18"/>
+              </w:rPr>
+              <w:t>)</w:t>
+            </w:r>
+          </w:p>
+          <w:p>
+            <w:pPr>
+              <w:spacing w:after="20"/>
+            </w:pPr>
+            <w:r>
+              <w:rPr>
+                <w:rFonts w:ascii="Consolas" w:eastAsia="Consolas" w:hAnsi="Consolas" w:cs="Consolas"/>
+                <w:sz w:val="18"/>
+                <w:szCs w:val="18"/>
+              </w:rPr>
+              <w:t xml:space="preserve">       - Plot log-log error vs h per function (</w:t>
+            </w:r>
+            <w:proofErr w:type="spellStart"/>
+            <w:proofErr w:type="gramStart"/>
+            <w:r>
+              <w:rPr>
+                <w:rFonts w:ascii="Consolas" w:eastAsia="Consolas" w:hAnsi="Consolas" w:cs="Consolas"/>
+                <w:sz w:val="18"/>
+                <w:szCs w:val="18"/>
+              </w:rPr>
+              <w:t>visualizer.plot</w:t>
+            </w:r>
+            <w:proofErr w:type="gramEnd"/>
+            <w:r>
+              <w:rPr>
+                <w:rFonts w:ascii="Consolas" w:eastAsia="Consolas" w:hAnsi="Consolas" w:cs="Consolas"/>
+                <w:sz w:val="18"/>
+                <w:szCs w:val="18"/>
+              </w:rPr>
+              <w:t>_convergence_loglog</w:t>
+            </w:r>
+            <w:proofErr w:type="spellEnd"/>
+            <w:r>
+              <w:rPr>
+                <w:rFonts w:ascii="Consolas" w:eastAsia="Consolas" w:hAnsi="Consolas" w:cs="Consolas"/>
+                <w:sz w:val="18"/>
+                <w:szCs w:val="18"/>
+              </w:rPr>
+              <w:t>)</w:t>
+            </w:r>
+          </w:p>
+          <w:p>
+            <w:pPr>
+              <w:spacing w:after="20"/>
+            </w:pPr>
+            <w:r>
+              <w:rPr>
+                <w:rFonts w:ascii="Consolas" w:eastAsia="Consolas" w:hAnsi="Consolas" w:cs="Consolas"/>
+                <w:sz w:val="18"/>
+                <w:szCs w:val="18"/>
+              </w:rPr>
+              <w:t xml:space="preserve">       - Plot a combined overview of all functions (</w:t>
+            </w:r>
+            <w:proofErr w:type="spellStart"/>
+            <w:proofErr w:type="gramStart"/>
+            <w:r>
+              <w:rPr>
+                <w:rFonts w:ascii="Consolas" w:eastAsia="Consolas" w:hAnsi="Consolas" w:cs="Consolas"/>
+                <w:sz w:val="18"/>
+                <w:szCs w:val="18"/>
+              </w:rPr>
+              <w:t>visualizer.plot</w:t>
+            </w:r>
+            <w:proofErr w:type="gramEnd"/>
+            <w:r>
+              <w:rPr>
+                <w:rFonts w:ascii="Consolas" w:eastAsia="Consolas" w:hAnsi="Consolas" w:cs="Consolas"/>
+                <w:sz w:val="18"/>
+                <w:szCs w:val="18"/>
+              </w:rPr>
+              <w:t>_all_convergence_overview</w:t>
+            </w:r>
+            <w:proofErr w:type="spellEnd"/>
+            <w:r>
+              <w:rPr>
+                <w:rFonts w:ascii="Consolas" w:eastAsia="Consolas" w:hAnsi="Consolas" w:cs="Consolas"/>
+                <w:sz w:val="18"/>
+                <w:szCs w:val="18"/>
+              </w:rPr>
+              <w:t>)</w:t>
+            </w:r>
+          </w:p>
+          <w:p>
+            <w:pPr>
+              <w:spacing w:after="20"/>
+            </w:pPr>
+            <w:r>
+              <w:rPr>
+                <w:rFonts w:ascii="Consolas" w:eastAsia="Consolas" w:hAnsi="Consolas" w:cs="Consolas"/>
+                <w:sz w:val="18"/>
+                <w:szCs w:val="18"/>
+              </w:rPr>
+              <w:t xml:space="preserve">       - Write text report with answers to Q1-Q6 (</w:t>
+            </w:r>
+            <w:proofErr w:type="spellStart"/>
+            <w:r>
+              <w:rPr>
+                <w:rFonts w:ascii="Consolas" w:eastAsia="Consolas" w:hAnsi="Consolas" w:cs="Consolas"/>
+                <w:sz w:val="18"/>
+                <w:szCs w:val="18"/>
+              </w:rPr>
+              <w:t>file_</w:t>
+            </w:r>
+            <w:proofErr w:type="gramStart"/>
+            <w:r>
+              <w:rPr>
+                <w:rFonts w:ascii="Consolas" w:eastAsia="Consolas" w:hAnsi="Consolas" w:cs="Consolas"/>
+                <w:sz w:val="18"/>
+                <w:szCs w:val="18"/>
+              </w:rPr>
+              <w:t>handler.save</w:t>
+            </w:r>
+            <w:proofErr w:type="gramEnd"/>
+            <w:r>
+              <w:rPr>
+                <w:rFonts w:ascii="Consolas" w:eastAsia="Consolas" w:hAnsi="Consolas" w:cs="Consolas"/>
+                <w:sz w:val="18"/>
+                <w:szCs w:val="18"/>
+              </w:rPr>
+              <w:t>_text_report</w:t>
+            </w:r>
+            <w:proofErr w:type="spellEnd"/>
+            <w:r>
+              <w:rPr>
+                <w:rFonts w:ascii="Consolas" w:eastAsia="Consolas" w:hAnsi="Consolas" w:cs="Consolas"/>
+                <w:sz w:val="18"/>
+                <w:szCs w:val="18"/>
+              </w:rPr>
+              <w:t>)</w:t>
             </w:r>
           </w:p>
           <w:p>
@@ -852,7 +1726,29 @@
           <w:sz w:val="18"/>
           <w:szCs w:val="18"/>
         </w:rPr>
-        <w:t>Figure 1. The four test functions: eˣ, sin(x), cos(x), and x³ − 2x + 1.</w:t>
+        <w:t xml:space="preserve">Figure 1. The four test functions: </w:t>
+      </w:r>
+      <w:proofErr w:type="spellStart"/>
+      <w:r>
+        <w:rPr>
+          <w:i/>
+          <w:iCs/>
+          <w:color w:val="555555"/>
+          <w:sz w:val="18"/>
+          <w:szCs w:val="18"/>
+        </w:rPr>
+        <w:t>eˣ</w:t>
+      </w:r>
+      <w:proofErr w:type="spellEnd"/>
+      <w:r>
+        <w:rPr>
+          <w:i/>
+          <w:iCs/>
+          <w:color w:val="555555"/>
+          <w:sz w:val="18"/>
+          <w:szCs w:val="18"/>
+        </w:rPr>
+        <w:t>, sin(x), cos(x), and x³ − 2x + 1.</w:t>
       </w:r>
     </w:p>
     <w:p>
@@ -900,8 +1796,18 @@
           <w:bCs/>
           <w:color w:val="000000" w:themeColor="text1"/>
         </w:rPr>
-        <w:t>f(x) = e^x</w:t>
+        <w:t xml:space="preserve">f(x) = </w:t>
       </w:r>
+      <w:proofErr w:type="spellStart"/>
+      <w:r>
+        <w:rPr>
+          <w:b/>
+          <w:bCs/>
+          <w:color w:val="000000" w:themeColor="text1"/>
+        </w:rPr>
+        <w:t>e^x</w:t>
+      </w:r>
+      <w:proofErr w:type="spellEnd"/>
     </w:p>
     <w:tbl>
       <w:tblPr>
@@ -929,12 +1835,6 @@
         <w:gridCol w:w="1762"/>
       </w:tblGrid>
       <w:tr>
-        <w:tblPrEx>
-          <w:tblCellMar>
-            <w:top w:w="0" w:type="dxa"/>
-            <w:bottom w:w="0" w:type="dxa"/>
-          </w:tblCellMar>
-        </w:tblPrEx>
         <w:trPr>
           <w:tblHeader/>
         </w:trPr>
@@ -1108,12 +2008,6 @@
         </w:tc>
       </w:tr>
       <w:tr>
-        <w:tblPrEx>
-          <w:tblCellMar>
-            <w:top w:w="0" w:type="dxa"/>
-            <w:bottom w:w="0" w:type="dxa"/>
-          </w:tblCellMar>
-        </w:tblPrEx>
         <w:tc>
           <w:tcPr>
             <w:tcW w:w="1080" w:type="dxa"/>
@@ -1272,12 +2166,6 @@
         </w:tc>
       </w:tr>
       <w:tr>
-        <w:tblPrEx>
-          <w:tblCellMar>
-            <w:top w:w="0" w:type="dxa"/>
-            <w:bottom w:w="0" w:type="dxa"/>
-          </w:tblCellMar>
-        </w:tblPrEx>
         <w:tc>
           <w:tcPr>
             <w:tcW w:w="1080" w:type="dxa"/>
@@ -1436,12 +2324,6 @@
         </w:tc>
       </w:tr>
       <w:tr>
-        <w:tblPrEx>
-          <w:tblCellMar>
-            <w:top w:w="0" w:type="dxa"/>
-            <w:bottom w:w="0" w:type="dxa"/>
-          </w:tblCellMar>
-        </w:tblPrEx>
         <w:tc>
           <w:tcPr>
             <w:tcW w:w="1080" w:type="dxa"/>
@@ -1600,12 +2482,6 @@
         </w:tc>
       </w:tr>
       <w:tr>
-        <w:tblPrEx>
-          <w:tblCellMar>
-            <w:top w:w="0" w:type="dxa"/>
-            <w:bottom w:w="0" w:type="dxa"/>
-          </w:tblCellMar>
-        </w:tblPrEx>
         <w:tc>
           <w:tcPr>
             <w:tcW w:w="1080" w:type="dxa"/>
@@ -1764,12 +2640,6 @@
         </w:tc>
       </w:tr>
       <w:tr>
-        <w:tblPrEx>
-          <w:tblCellMar>
-            <w:top w:w="0" w:type="dxa"/>
-            <w:bottom w:w="0" w:type="dxa"/>
-          </w:tblCellMar>
-        </w:tblPrEx>
         <w:tc>
           <w:tcPr>
             <w:tcW w:w="1080" w:type="dxa"/>
@@ -1928,12 +2798,6 @@
         </w:tc>
       </w:tr>
       <w:tr>
-        <w:tblPrEx>
-          <w:tblCellMar>
-            <w:top w:w="0" w:type="dxa"/>
-            <w:bottom w:w="0" w:type="dxa"/>
-          </w:tblCellMar>
-        </w:tblPrEx>
         <w:tc>
           <w:tcPr>
             <w:tcW w:w="1080" w:type="dxa"/>
@@ -2092,12 +2956,6 @@
         </w:tc>
       </w:tr>
       <w:tr>
-        <w:tblPrEx>
-          <w:tblCellMar>
-            <w:top w:w="0" w:type="dxa"/>
-            <w:bottom w:w="0" w:type="dxa"/>
-          </w:tblCellMar>
-        </w:tblPrEx>
         <w:tc>
           <w:tcPr>
             <w:tcW w:w="1080" w:type="dxa"/>
@@ -2256,12 +3114,6 @@
         </w:tc>
       </w:tr>
       <w:tr>
-        <w:tblPrEx>
-          <w:tblCellMar>
-            <w:top w:w="0" w:type="dxa"/>
-            <w:bottom w:w="0" w:type="dxa"/>
-          </w:tblCellMar>
-        </w:tblPrEx>
         <w:tc>
           <w:tcPr>
             <w:tcW w:w="1080" w:type="dxa"/>
@@ -2420,12 +3272,6 @@
         </w:tc>
       </w:tr>
       <w:tr>
-        <w:tblPrEx>
-          <w:tblCellMar>
-            <w:top w:w="0" w:type="dxa"/>
-            <w:bottom w:w="0" w:type="dxa"/>
-          </w:tblCellMar>
-        </w:tblPrEx>
         <w:tc>
           <w:tcPr>
             <w:tcW w:w="1080" w:type="dxa"/>
@@ -2584,12 +3430,6 @@
         </w:tc>
       </w:tr>
       <w:tr>
-        <w:tblPrEx>
-          <w:tblCellMar>
-            <w:top w:w="0" w:type="dxa"/>
-            <w:bottom w:w="0" w:type="dxa"/>
-          </w:tblCellMar>
-        </w:tblPrEx>
         <w:tc>
           <w:tcPr>
             <w:tcW w:w="1080" w:type="dxa"/>
@@ -2748,12 +3588,6 @@
         </w:tc>
       </w:tr>
       <w:tr>
-        <w:tblPrEx>
-          <w:tblCellMar>
-            <w:top w:w="0" w:type="dxa"/>
-            <w:bottom w:w="0" w:type="dxa"/>
-          </w:tblCellMar>
-        </w:tblPrEx>
         <w:tc>
           <w:tcPr>
             <w:tcW w:w="1080" w:type="dxa"/>
@@ -2912,12 +3746,6 @@
         </w:tc>
       </w:tr>
       <w:tr>
-        <w:tblPrEx>
-          <w:tblCellMar>
-            <w:top w:w="0" w:type="dxa"/>
-            <w:bottom w:w="0" w:type="dxa"/>
-          </w:tblCellMar>
-        </w:tblPrEx>
         <w:tc>
           <w:tcPr>
             <w:tcW w:w="1080" w:type="dxa"/>
@@ -3124,12 +3952,6 @@
         <w:gridCol w:w="1762"/>
       </w:tblGrid>
       <w:tr>
-        <w:tblPrEx>
-          <w:tblCellMar>
-            <w:top w:w="0" w:type="dxa"/>
-            <w:bottom w:w="0" w:type="dxa"/>
-          </w:tblCellMar>
-        </w:tblPrEx>
         <w:trPr>
           <w:tblHeader/>
         </w:trPr>
@@ -3303,12 +4125,6 @@
         </w:tc>
       </w:tr>
       <w:tr>
-        <w:tblPrEx>
-          <w:tblCellMar>
-            <w:top w:w="0" w:type="dxa"/>
-            <w:bottom w:w="0" w:type="dxa"/>
-          </w:tblCellMar>
-        </w:tblPrEx>
         <w:tc>
           <w:tcPr>
             <w:tcW w:w="1080" w:type="dxa"/>
@@ -3467,12 +4283,6 @@
         </w:tc>
       </w:tr>
       <w:tr>
-        <w:tblPrEx>
-          <w:tblCellMar>
-            <w:top w:w="0" w:type="dxa"/>
-            <w:bottom w:w="0" w:type="dxa"/>
-          </w:tblCellMar>
-        </w:tblPrEx>
         <w:tc>
           <w:tcPr>
             <w:tcW w:w="1080" w:type="dxa"/>
@@ -3631,12 +4441,6 @@
         </w:tc>
       </w:tr>
       <w:tr>
-        <w:tblPrEx>
-          <w:tblCellMar>
-            <w:top w:w="0" w:type="dxa"/>
-            <w:bottom w:w="0" w:type="dxa"/>
-          </w:tblCellMar>
-        </w:tblPrEx>
         <w:tc>
           <w:tcPr>
             <w:tcW w:w="1080" w:type="dxa"/>
@@ -3795,12 +4599,6 @@
         </w:tc>
       </w:tr>
       <w:tr>
-        <w:tblPrEx>
-          <w:tblCellMar>
-            <w:top w:w="0" w:type="dxa"/>
-            <w:bottom w:w="0" w:type="dxa"/>
-          </w:tblCellMar>
-        </w:tblPrEx>
         <w:tc>
           <w:tcPr>
             <w:tcW w:w="1080" w:type="dxa"/>
@@ -3959,12 +4757,6 @@
         </w:tc>
       </w:tr>
       <w:tr>
-        <w:tblPrEx>
-          <w:tblCellMar>
-            <w:top w:w="0" w:type="dxa"/>
-            <w:bottom w:w="0" w:type="dxa"/>
-          </w:tblCellMar>
-        </w:tblPrEx>
         <w:tc>
           <w:tcPr>
             <w:tcW w:w="1080" w:type="dxa"/>
@@ -4123,12 +4915,6 @@
         </w:tc>
       </w:tr>
       <w:tr>
-        <w:tblPrEx>
-          <w:tblCellMar>
-            <w:top w:w="0" w:type="dxa"/>
-            <w:bottom w:w="0" w:type="dxa"/>
-          </w:tblCellMar>
-        </w:tblPrEx>
         <w:tc>
           <w:tcPr>
             <w:tcW w:w="1080" w:type="dxa"/>
@@ -4287,12 +5073,6 @@
         </w:tc>
       </w:tr>
       <w:tr>
-        <w:tblPrEx>
-          <w:tblCellMar>
-            <w:top w:w="0" w:type="dxa"/>
-            <w:bottom w:w="0" w:type="dxa"/>
-          </w:tblCellMar>
-        </w:tblPrEx>
         <w:tc>
           <w:tcPr>
             <w:tcW w:w="1080" w:type="dxa"/>
@@ -4451,12 +5231,6 @@
         </w:tc>
       </w:tr>
       <w:tr>
-        <w:tblPrEx>
-          <w:tblCellMar>
-            <w:top w:w="0" w:type="dxa"/>
-            <w:bottom w:w="0" w:type="dxa"/>
-          </w:tblCellMar>
-        </w:tblPrEx>
         <w:tc>
           <w:tcPr>
             <w:tcW w:w="1080" w:type="dxa"/>
@@ -4615,12 +5389,6 @@
         </w:tc>
       </w:tr>
       <w:tr>
-        <w:tblPrEx>
-          <w:tblCellMar>
-            <w:top w:w="0" w:type="dxa"/>
-            <w:bottom w:w="0" w:type="dxa"/>
-          </w:tblCellMar>
-        </w:tblPrEx>
         <w:tc>
           <w:tcPr>
             <w:tcW w:w="1080" w:type="dxa"/>
@@ -4779,12 +5547,6 @@
         </w:tc>
       </w:tr>
       <w:tr>
-        <w:tblPrEx>
-          <w:tblCellMar>
-            <w:top w:w="0" w:type="dxa"/>
-            <w:bottom w:w="0" w:type="dxa"/>
-          </w:tblCellMar>
-        </w:tblPrEx>
         <w:tc>
           <w:tcPr>
             <w:tcW w:w="1080" w:type="dxa"/>
@@ -4943,12 +5705,6 @@
         </w:tc>
       </w:tr>
       <w:tr>
-        <w:tblPrEx>
-          <w:tblCellMar>
-            <w:top w:w="0" w:type="dxa"/>
-            <w:bottom w:w="0" w:type="dxa"/>
-          </w:tblCellMar>
-        </w:tblPrEx>
         <w:tc>
           <w:tcPr>
             <w:tcW w:w="1080" w:type="dxa"/>
@@ -5107,12 +5863,6 @@
         </w:tc>
       </w:tr>
       <w:tr>
-        <w:tblPrEx>
-          <w:tblCellMar>
-            <w:top w:w="0" w:type="dxa"/>
-            <w:bottom w:w="0" w:type="dxa"/>
-          </w:tblCellMar>
-        </w:tblPrEx>
         <w:tc>
           <w:tcPr>
             <w:tcW w:w="1080" w:type="dxa"/>
@@ -5319,12 +6069,6 @@
         <w:gridCol w:w="1762"/>
       </w:tblGrid>
       <w:tr>
-        <w:tblPrEx>
-          <w:tblCellMar>
-            <w:top w:w="0" w:type="dxa"/>
-            <w:bottom w:w="0" w:type="dxa"/>
-          </w:tblCellMar>
-        </w:tblPrEx>
         <w:trPr>
           <w:tblHeader/>
         </w:trPr>
@@ -5498,12 +6242,6 @@
         </w:tc>
       </w:tr>
       <w:tr>
-        <w:tblPrEx>
-          <w:tblCellMar>
-            <w:top w:w="0" w:type="dxa"/>
-            <w:bottom w:w="0" w:type="dxa"/>
-          </w:tblCellMar>
-        </w:tblPrEx>
         <w:tc>
           <w:tcPr>
             <w:tcW w:w="1080" w:type="dxa"/>
@@ -5662,12 +6400,6 @@
         </w:tc>
       </w:tr>
       <w:tr>
-        <w:tblPrEx>
-          <w:tblCellMar>
-            <w:top w:w="0" w:type="dxa"/>
-            <w:bottom w:w="0" w:type="dxa"/>
-          </w:tblCellMar>
-        </w:tblPrEx>
         <w:tc>
           <w:tcPr>
             <w:tcW w:w="1080" w:type="dxa"/>
@@ -5826,12 +6558,6 @@
         </w:tc>
       </w:tr>
       <w:tr>
-        <w:tblPrEx>
-          <w:tblCellMar>
-            <w:top w:w="0" w:type="dxa"/>
-            <w:bottom w:w="0" w:type="dxa"/>
-          </w:tblCellMar>
-        </w:tblPrEx>
         <w:tc>
           <w:tcPr>
             <w:tcW w:w="1080" w:type="dxa"/>
@@ -5990,12 +6716,6 @@
         </w:tc>
       </w:tr>
       <w:tr>
-        <w:tblPrEx>
-          <w:tblCellMar>
-            <w:top w:w="0" w:type="dxa"/>
-            <w:bottom w:w="0" w:type="dxa"/>
-          </w:tblCellMar>
-        </w:tblPrEx>
         <w:tc>
           <w:tcPr>
             <w:tcW w:w="1080" w:type="dxa"/>
@@ -6154,12 +6874,6 @@
         </w:tc>
       </w:tr>
       <w:tr>
-        <w:tblPrEx>
-          <w:tblCellMar>
-            <w:top w:w="0" w:type="dxa"/>
-            <w:bottom w:w="0" w:type="dxa"/>
-          </w:tblCellMar>
-        </w:tblPrEx>
         <w:tc>
           <w:tcPr>
             <w:tcW w:w="1080" w:type="dxa"/>
@@ -6319,12 +7033,6 @@
         </w:tc>
       </w:tr>
       <w:tr>
-        <w:tblPrEx>
-          <w:tblCellMar>
-            <w:top w:w="0" w:type="dxa"/>
-            <w:bottom w:w="0" w:type="dxa"/>
-          </w:tblCellMar>
-        </w:tblPrEx>
         <w:tc>
           <w:tcPr>
             <w:tcW w:w="1080" w:type="dxa"/>
@@ -6483,12 +7191,6 @@
         </w:tc>
       </w:tr>
       <w:tr>
-        <w:tblPrEx>
-          <w:tblCellMar>
-            <w:top w:w="0" w:type="dxa"/>
-            <w:bottom w:w="0" w:type="dxa"/>
-          </w:tblCellMar>
-        </w:tblPrEx>
         <w:tc>
           <w:tcPr>
             <w:tcW w:w="1080" w:type="dxa"/>
@@ -6647,12 +7349,6 @@
         </w:tc>
       </w:tr>
       <w:tr>
-        <w:tblPrEx>
-          <w:tblCellMar>
-            <w:top w:w="0" w:type="dxa"/>
-            <w:bottom w:w="0" w:type="dxa"/>
-          </w:tblCellMar>
-        </w:tblPrEx>
         <w:tc>
           <w:tcPr>
             <w:tcW w:w="1080" w:type="dxa"/>
@@ -6811,12 +7507,6 @@
         </w:tc>
       </w:tr>
       <w:tr>
-        <w:tblPrEx>
-          <w:tblCellMar>
-            <w:top w:w="0" w:type="dxa"/>
-            <w:bottom w:w="0" w:type="dxa"/>
-          </w:tblCellMar>
-        </w:tblPrEx>
         <w:tc>
           <w:tcPr>
             <w:tcW w:w="1080" w:type="dxa"/>
@@ -6975,12 +7665,6 @@
         </w:tc>
       </w:tr>
       <w:tr>
-        <w:tblPrEx>
-          <w:tblCellMar>
-            <w:top w:w="0" w:type="dxa"/>
-            <w:bottom w:w="0" w:type="dxa"/>
-          </w:tblCellMar>
-        </w:tblPrEx>
         <w:tc>
           <w:tcPr>
             <w:tcW w:w="1080" w:type="dxa"/>
@@ -7139,12 +7823,6 @@
         </w:tc>
       </w:tr>
       <w:tr>
-        <w:tblPrEx>
-          <w:tblCellMar>
-            <w:top w:w="0" w:type="dxa"/>
-            <w:bottom w:w="0" w:type="dxa"/>
-          </w:tblCellMar>
-        </w:tblPrEx>
         <w:tc>
           <w:tcPr>
             <w:tcW w:w="1080" w:type="dxa"/>
@@ -7303,12 +7981,6 @@
         </w:tc>
       </w:tr>
       <w:tr>
-        <w:tblPrEx>
-          <w:tblCellMar>
-            <w:top w:w="0" w:type="dxa"/>
-            <w:bottom w:w="0" w:type="dxa"/>
-          </w:tblCellMar>
-        </w:tblPrEx>
         <w:tc>
           <w:tcPr>
             <w:tcW w:w="1080" w:type="dxa"/>
@@ -7515,12 +8187,6 @@
         <w:gridCol w:w="1762"/>
       </w:tblGrid>
       <w:tr>
-        <w:tblPrEx>
-          <w:tblCellMar>
-            <w:top w:w="0" w:type="dxa"/>
-            <w:bottom w:w="0" w:type="dxa"/>
-          </w:tblCellMar>
-        </w:tblPrEx>
         <w:trPr>
           <w:tblHeader/>
         </w:trPr>
@@ -7694,12 +8360,6 @@
         </w:tc>
       </w:tr>
       <w:tr>
-        <w:tblPrEx>
-          <w:tblCellMar>
-            <w:top w:w="0" w:type="dxa"/>
-            <w:bottom w:w="0" w:type="dxa"/>
-          </w:tblCellMar>
-        </w:tblPrEx>
         <w:tc>
           <w:tcPr>
             <w:tcW w:w="1080" w:type="dxa"/>
@@ -7858,12 +8518,6 @@
         </w:tc>
       </w:tr>
       <w:tr>
-        <w:tblPrEx>
-          <w:tblCellMar>
-            <w:top w:w="0" w:type="dxa"/>
-            <w:bottom w:w="0" w:type="dxa"/>
-          </w:tblCellMar>
-        </w:tblPrEx>
         <w:tc>
           <w:tcPr>
             <w:tcW w:w="1080" w:type="dxa"/>
@@ -8022,12 +8676,6 @@
         </w:tc>
       </w:tr>
       <w:tr>
-        <w:tblPrEx>
-          <w:tblCellMar>
-            <w:top w:w="0" w:type="dxa"/>
-            <w:bottom w:w="0" w:type="dxa"/>
-          </w:tblCellMar>
-        </w:tblPrEx>
         <w:tc>
           <w:tcPr>
             <w:tcW w:w="1080" w:type="dxa"/>
@@ -8186,12 +8834,6 @@
         </w:tc>
       </w:tr>
       <w:tr>
-        <w:tblPrEx>
-          <w:tblCellMar>
-            <w:top w:w="0" w:type="dxa"/>
-            <w:bottom w:w="0" w:type="dxa"/>
-          </w:tblCellMar>
-        </w:tblPrEx>
         <w:tc>
           <w:tcPr>
             <w:tcW w:w="1080" w:type="dxa"/>
@@ -8350,12 +8992,6 @@
         </w:tc>
       </w:tr>
       <w:tr>
-        <w:tblPrEx>
-          <w:tblCellMar>
-            <w:top w:w="0" w:type="dxa"/>
-            <w:bottom w:w="0" w:type="dxa"/>
-          </w:tblCellMar>
-        </w:tblPrEx>
         <w:tc>
           <w:tcPr>
             <w:tcW w:w="1080" w:type="dxa"/>
@@ -8514,12 +9150,6 @@
         </w:tc>
       </w:tr>
       <w:tr>
-        <w:tblPrEx>
-          <w:tblCellMar>
-            <w:top w:w="0" w:type="dxa"/>
-            <w:bottom w:w="0" w:type="dxa"/>
-          </w:tblCellMar>
-        </w:tblPrEx>
         <w:tc>
           <w:tcPr>
             <w:tcW w:w="1080" w:type="dxa"/>
@@ -8678,12 +9308,6 @@
         </w:tc>
       </w:tr>
       <w:tr>
-        <w:tblPrEx>
-          <w:tblCellMar>
-            <w:top w:w="0" w:type="dxa"/>
-            <w:bottom w:w="0" w:type="dxa"/>
-          </w:tblCellMar>
-        </w:tblPrEx>
         <w:tc>
           <w:tcPr>
             <w:tcW w:w="1080" w:type="dxa"/>
@@ -8842,12 +9466,6 @@
         </w:tc>
       </w:tr>
       <w:tr>
-        <w:tblPrEx>
-          <w:tblCellMar>
-            <w:top w:w="0" w:type="dxa"/>
-            <w:bottom w:w="0" w:type="dxa"/>
-          </w:tblCellMar>
-        </w:tblPrEx>
         <w:tc>
           <w:tcPr>
             <w:tcW w:w="1080" w:type="dxa"/>
@@ -9006,12 +9624,6 @@
         </w:tc>
       </w:tr>
       <w:tr>
-        <w:tblPrEx>
-          <w:tblCellMar>
-            <w:top w:w="0" w:type="dxa"/>
-            <w:bottom w:w="0" w:type="dxa"/>
-          </w:tblCellMar>
-        </w:tblPrEx>
         <w:tc>
           <w:tcPr>
             <w:tcW w:w="1080" w:type="dxa"/>
@@ -9170,12 +9782,6 @@
         </w:tc>
       </w:tr>
       <w:tr>
-        <w:tblPrEx>
-          <w:tblCellMar>
-            <w:top w:w="0" w:type="dxa"/>
-            <w:bottom w:w="0" w:type="dxa"/>
-          </w:tblCellMar>
-        </w:tblPrEx>
         <w:tc>
           <w:tcPr>
             <w:tcW w:w="1080" w:type="dxa"/>
@@ -9334,12 +9940,6 @@
         </w:tc>
       </w:tr>
       <w:tr>
-        <w:tblPrEx>
-          <w:tblCellMar>
-            <w:top w:w="0" w:type="dxa"/>
-            <w:bottom w:w="0" w:type="dxa"/>
-          </w:tblCellMar>
-        </w:tblPrEx>
         <w:tc>
           <w:tcPr>
             <w:tcW w:w="1080" w:type="dxa"/>
@@ -9498,12 +10098,6 @@
         </w:tc>
       </w:tr>
       <w:tr>
-        <w:tblPrEx>
-          <w:tblCellMar>
-            <w:top w:w="0" w:type="dxa"/>
-            <w:bottom w:w="0" w:type="dxa"/>
-          </w:tblCellMar>
-        </w:tblPrEx>
         <w:tc>
           <w:tcPr>
             <w:tcW w:w="1080" w:type="dxa"/>
@@ -9696,7 +10290,15 @@
         <w:jc w:val="both"/>
       </w:pPr>
       <w:r>
-        <w:t>For each function, log₁₀(|error|) was plotted against log₁₀(h). The slope of this log-log curve estimates the empirical convergence order p in error ≈ C·hᵖ. Two slopes are reported: the slope fit only over the truncation-error-dominated region (the leading run of h values where error is still decreasing, and which should match theory), and the slope over the full range of h (including the round-off-dominated tail, shown for discussion).</w:t>
+        <w:t xml:space="preserve">For each function, log₁₀(|error|) was plotted against log₁₀(h). The slope of this log-log curve estimates the empirical convergence order p in error ≈ </w:t>
+      </w:r>
+      <w:proofErr w:type="spellStart"/>
+      <w:r>
+        <w:t>C·h</w:t>
+      </w:r>
+      <w:proofErr w:type="spellEnd"/>
+      <w:r>
+        <w:t>ᵖ. Two slopes are reported: the slope fit only over the truncation-error-dominated region (the leading run of h values where error is still decreasing, and which should match theory), and the slope over the full range of h (including the round-off-dominated tail, shown for discussion).</w:t>
       </w:r>
     </w:p>
     <w:tbl>
@@ -9726,12 +10328,6 @@
         <w:gridCol w:w="1500"/>
       </w:tblGrid>
       <w:tr>
-        <w:tblPrEx>
-          <w:tblCellMar>
-            <w:top w:w="0" w:type="dxa"/>
-            <w:bottom w:w="0" w:type="dxa"/>
-          </w:tblCellMar>
-        </w:tblPrEx>
         <w:trPr>
           <w:tblHeader/>
         </w:trPr>
@@ -9930,12 +10526,6 @@
         </w:tc>
       </w:tr>
       <w:tr>
-        <w:tblPrEx>
-          <w:tblCellMar>
-            <w:top w:w="0" w:type="dxa"/>
-            <w:bottom w:w="0" w:type="dxa"/>
-          </w:tblCellMar>
-        </w:tblPrEx>
         <w:tc>
           <w:tcPr>
             <w:tcW w:w="2280" w:type="dxa"/>
@@ -9955,8 +10545,18 @@
                 <w:sz w:val="17"/>
                 <w:szCs w:val="17"/>
               </w:rPr>
-              <w:t>f(x) = e^x</w:t>
-            </w:r>
+              <w:t xml:space="preserve">f(x) = </w:t>
+            </w:r>
+            <w:proofErr w:type="spellStart"/>
+            <w:r>
+              <w:rPr>
+                <w:color w:val="000000"/>
+                <w:sz w:val="17"/>
+                <w:szCs w:val="17"/>
+              </w:rPr>
+              <w:t>e^x</w:t>
+            </w:r>
+            <w:proofErr w:type="spellEnd"/>
           </w:p>
         </w:tc>
         <w:tc>
@@ -10117,12 +10717,6 @@
         </w:tc>
       </w:tr>
       <w:tr>
-        <w:tblPrEx>
-          <w:tblCellMar>
-            <w:top w:w="0" w:type="dxa"/>
-            <w:bottom w:w="0" w:type="dxa"/>
-          </w:tblCellMar>
-        </w:tblPrEx>
         <w:tc>
           <w:tcPr>
             <w:tcW w:w="2280" w:type="dxa"/>
@@ -10304,12 +10898,6 @@
         </w:tc>
       </w:tr>
       <w:tr>
-        <w:tblPrEx>
-          <w:tblCellMar>
-            <w:top w:w="0" w:type="dxa"/>
-            <w:bottom w:w="0" w:type="dxa"/>
-          </w:tblCellMar>
-        </w:tblPrEx>
         <w:tc>
           <w:tcPr>
             <w:tcW w:w="2280" w:type="dxa"/>
@@ -10491,12 +11079,6 @@
         </w:tc>
       </w:tr>
       <w:tr>
-        <w:tblPrEx>
-          <w:tblCellMar>
-            <w:top w:w="0" w:type="dxa"/>
-            <w:bottom w:w="0" w:type="dxa"/>
-          </w:tblCellMar>
-        </w:tblPrEx>
         <w:tc>
           <w:tcPr>
             <w:tcW w:w="2280" w:type="dxa"/>
@@ -10833,7 +11415,29 @@
           <w:sz w:val="18"/>
           <w:szCs w:val="18"/>
         </w:rPr>
-        <w:t>Figure 3a. Convergence for f(x) = eˣ.</w:t>
+        <w:t xml:space="preserve">Figure 3a. Convergence for f(x) = </w:t>
+      </w:r>
+      <w:proofErr w:type="spellStart"/>
+      <w:r>
+        <w:rPr>
+          <w:i/>
+          <w:iCs/>
+          <w:color w:val="555555"/>
+          <w:sz w:val="18"/>
+          <w:szCs w:val="18"/>
+        </w:rPr>
+        <w:t>eˣ</w:t>
+      </w:r>
+      <w:proofErr w:type="spellEnd"/>
+      <w:r>
+        <w:rPr>
+          <w:i/>
+          <w:iCs/>
+          <w:color w:val="555555"/>
+          <w:sz w:val="18"/>
+          <w:szCs w:val="18"/>
+        </w:rPr>
+        <w:t>.</w:t>
       </w:r>
     </w:p>
     <w:p>
@@ -11126,7 +11730,15 @@
         <w:jc w:val="both"/>
       </w:pPr>
       <w:r>
-        <w:t>No. Richardson's error decreases rapidly at first (as O(h⁴) predicts), but for very small h (typically below ≈ 10⁻⁴ to 10⁻⁵, depending on the function) the error stops decreasing and eventually increases again. This happens because subtracting nearly-equal floating-point numbers f(x+h) and f(x−h) loses significant digits (catastrophic cancellation), and Richardson's extra combination step (4·D(h/2) − D(h)) further amplifies this round-off noise.</w:t>
+        <w:t>No. Richardson's error decreases rapidly at first (as O(h⁴) predicts), but for very small h (typically below ≈ 10⁻⁴ to 10⁻⁵, depending on the function) the error stops decreasing and eventually increases again. This happens because subtracting nearly-equal floating-point numbers f(</w:t>
+      </w:r>
+      <w:proofErr w:type="spellStart"/>
+      <w:r>
+        <w:t>x+h</w:t>
+      </w:r>
+      <w:proofErr w:type="spellEnd"/>
+      <w:r>
+        <w:t>) and f(x−h) loses significant digits (catastrophic cancellation), and Richardson's extra combination step (4·D(h/2) − D(h)) further amplifies this round-off noise.</w:t>
       </w:r>
     </w:p>
     <w:p>
@@ -11169,7 +11781,25 @@
           <w:bCs/>
           <w:color w:val="000000" w:themeColor="text1"/>
         </w:rPr>
-        <w:t>Q5. Does Richardson achieve the expected O(h⁴) behavior?</w:t>
+        <w:t xml:space="preserve">Q5. Does Richardson achieve the expected O(h⁴) </w:t>
+      </w:r>
+      <w:proofErr w:type="spellStart"/>
+      <w:r>
+        <w:rPr>
+          <w:b/>
+          <w:bCs/>
+          <w:color w:val="000000" w:themeColor="text1"/>
+        </w:rPr>
+        <w:t>behavior</w:t>
+      </w:r>
+      <w:proofErr w:type="spellEnd"/>
+      <w:r>
+        <w:rPr>
+          <w:b/>
+          <w:bCs/>
+          <w:color w:val="000000" w:themeColor="text1"/>
+        </w:rPr>
+        <w:t>?</w:t>
       </w:r>
     </w:p>
     <w:p>
@@ -11204,7 +11834,31 @@
         <w:jc w:val="both"/>
       </w:pPr>
       <w:r>
-        <w:t>Every function evaluation in double precision carries a relative round-off error of about 10⁻¹⁶. The central difference formula divides a small difference f(x+h) − f(x−h) by 2h; as h shrinks, that difference shrinks toward the size of the round-off noise itself, so the relative round-off error in the result grows like O(machine epsilon / h). Total error is therefore the sum of a decreasing truncation term (O(h²) or O(h⁴)) and this growing round-off term. There is an optimal h that minimizes total error; pushing h smaller than that (roughly h &lt; 10⁻⁵ to 10⁻⁶ for Central Difference, and even larger for Richardson, since it involves an extra subtraction) makes results worse, not better. This is exactly the upturn visible on the right-hand side of the log-log error plots and in the results table for h = 10⁻⁷ through 10⁻¹².</w:t>
+        <w:t>Every function evaluation in double precision carries a relative round-off error of about 10⁻¹⁶. The central difference formula divides a small difference f(</w:t>
+      </w:r>
+      <w:proofErr w:type="spellStart"/>
+      <w:r>
+        <w:t>x+h</w:t>
+      </w:r>
+      <w:proofErr w:type="spellEnd"/>
+      <w:r>
+        <w:t xml:space="preserve">) − f(x−h) by 2h; </w:t>
+      </w:r>
+      <w:proofErr w:type="spellStart"/>
+      <w:r>
+        <w:t>as h</w:t>
+      </w:r>
+      <w:proofErr w:type="spellEnd"/>
+      <w:r>
+        <w:t xml:space="preserve"> shrinks, that difference shrinks toward the size of the round-off noise itself, so the relative round-off error in the result grows like </w:t>
+      </w:r>
+      <w:proofErr w:type="gramStart"/>
+      <w:r>
+        <w:t>O(</w:t>
+      </w:r>
+      <w:proofErr w:type="gramEnd"/>
+      <w:r>
+        <w:t>machine epsilon / h). Total error is therefore the sum of a decreasing truncation term (O(h²) or O(h⁴)) and this growing round-off term. There is an optimal h that minimizes total error; pushing h smaller than that (roughly h &lt; 10⁻⁵ to 10⁻⁶ for Central Difference, and even larger for Richardson, since it involves an extra subtraction) makes results worse, not better. This is exactly the upturn visible on the right-hand side of the log-log error plots and in the results table for h = 10⁻⁷ through 10⁻¹².</w:t>
       </w:r>
     </w:p>
     <w:p>
@@ -11235,8 +11889,12 @@
       </w:r>
     </w:p>
     <w:sectPr>
-      <w:headerReference w:type="default" r:id="rId13"/>
-      <w:footerReference w:type="default" r:id="rId14"/>
+      <w:headerReference w:type="even" r:id="rId13"/>
+      <w:headerReference w:type="default" r:id="rId14"/>
+      <w:footerReference w:type="even" r:id="rId15"/>
+      <w:footerReference w:type="default" r:id="rId16"/>
+      <w:headerReference w:type="first" r:id="rId17"/>
+      <w:footerReference w:type="first" r:id="rId18"/>
       <w:pgSz w:w="12240" w:h="15840"/>
       <w:pgMar w:top="1080" w:right="1080" w:bottom="1080" w:left="1080" w:header="708" w:footer="708" w:gutter="0"/>
       <w:cols w:space="720"/>
@@ -11266,6 +11924,16 @@
 </file>
 
 <file path=word/footer1.xml><?xml version="1.0" encoding="utf-8"?>
+<w:ftr xmlns:wpc="http://schemas.microsoft.com/office/word/2010/wordprocessingCanvas" xmlns:cx="http://schemas.microsoft.com/office/drawing/2014/chartex" xmlns:cx1="http://schemas.microsoft.com/office/drawing/2015/9/8/chartex" xmlns:cx2="http://schemas.microsoft.com/office/drawing/2015/10/21/chartex" xmlns:cx3="http://schemas.microsoft.com/office/drawing/2016/5/9/chartex" xmlns:cx4="http://schemas.microsoft.com/office/drawing/2016/5/10/chartex" xmlns:cx5="http://schemas.microsoft.com/office/drawing/2016/5/11/chartex" xmlns:cx6="http://schemas.microsoft.com/office/drawing/2016/5/12/chartex" xmlns:cx7="http://schemas.microsoft.com/office/drawing/2016/5/13/chartex" xmlns:cx8="http://schemas.microsoft.com/office/drawing/2016/5/14/chartex" xmlns:mc="http://schemas.openxmlformats.org/markup-compatibility/2006" xmlns:aink="http://schemas.microsoft.com/office/drawing/2016/ink" xmlns:am3d="http://schemas.microsoft.com/office/drawing/2017/model3d" xmlns:o="urn:schemas-microsoft-com:office:office" xmlns:oel="http://schemas.microsoft.com/office/2019/extlst" xmlns:r="http://schemas.openxmlformats.org/officeDocument/2006/relationships" xmlns:m="http://schemas.openxmlformats.org/officeDocument/2006/math" xmlns:v="urn:schemas-microsoft-com:vml" xmlns:wp14="http://schemas.microsoft.com/office/word/2010/wordprocessingDrawing" xmlns:wp="http://schemas.openxmlformats.org/drawingml/2006/wordprocessingDrawing" xmlns:w10="urn:schemas-microsoft-com:office:word" xmlns:w="http://schemas.openxmlformats.org/wordprocessingml/2006/main" xmlns:w14="http://schemas.microsoft.com/office/word/2010/wordml" xmlns:w15="http://schemas.microsoft.com/office/word/2012/wordml" xmlns:w16cei="http://schemas.microsoft.com/office/word/2026/wordml/cei" xmlns:w16cex="http://schemas.microsoft.com/office/word/2018/wordml/cex" xmlns:w16cid="http://schemas.microsoft.com/office/word/2016/wordml/cid" xmlns:w16="http://schemas.microsoft.com/office/word/2018/wordml" xmlns:w16du="http://schemas.microsoft.com/office/word/2023/wordml/word16du" xmlns:w16sdtdh="http://schemas.microsoft.com/office/word/2020/wordml/sdtdatahash" xmlns:w16sdtfl="http://schemas.microsoft.com/office/word/2024/wordml/sdtformatlock" xmlns:w16se="http://schemas.microsoft.com/office/word/2015/wordml/symex" xmlns:wpg="http://schemas.microsoft.com/office/word/2010/wordprocessingGroup" xmlns:wpi="http://schemas.microsoft.com/office/word/2010/wordprocessingInk" xmlns:wne="http://schemas.microsoft.com/office/word/2006/wordml" xmlns:wps="http://schemas.microsoft.com/office/word/2010/wordprocessingShape" mc:Ignorable="w14 w15 w16se w16cid w16 w16cex w16sdtdh w16sdtfl w16du wp14">
+  <w:p>
+    <w:pPr>
+      <w:pStyle w:val="Footer"/>
+    </w:pPr>
+  </w:p>
+</w:ftr>
+</file>
+
+<file path=word/footer2.xml><?xml version="1.0" encoding="utf-8"?>
 <w:ftr xmlns:wpc="http://schemas.microsoft.com/office/word/2010/wordprocessingCanvas" xmlns:cx="http://schemas.microsoft.com/office/drawing/2014/chartex" xmlns:cx1="http://schemas.microsoft.com/office/drawing/2015/9/8/chartex" xmlns:cx2="http://schemas.microsoft.com/office/drawing/2015/10/21/chartex" xmlns:cx3="http://schemas.microsoft.com/office/drawing/2016/5/9/chartex" xmlns:cx4="http://schemas.microsoft.com/office/drawing/2016/5/10/chartex" xmlns:cx5="http://schemas.microsoft.com/office/drawing/2016/5/11/chartex" xmlns:cx6="http://schemas.microsoft.com/office/drawing/2016/5/12/chartex" xmlns:cx7="http://schemas.microsoft.com/office/drawing/2016/5/13/chartex" xmlns:cx8="http://schemas.microsoft.com/office/drawing/2016/5/14/chartex" xmlns:mc="http://schemas.openxmlformats.org/markup-compatibility/2006" xmlns:aink="http://schemas.microsoft.com/office/drawing/2016/ink" xmlns:am3d="http://schemas.microsoft.com/office/drawing/2017/model3d" xmlns:o="urn:schemas-microsoft-com:office:office" xmlns:oel="http://schemas.microsoft.com/office/2019/extlst" xmlns:r="http://schemas.openxmlformats.org/officeDocument/2006/relationships" xmlns:m="http://schemas.openxmlformats.org/officeDocument/2006/math" xmlns:v="urn:schemas-microsoft-com:vml" xmlns:wp14="http://schemas.microsoft.com/office/word/2010/wordprocessingDrawing" xmlns:wp="http://schemas.openxmlformats.org/drawingml/2006/wordprocessingDrawing" xmlns:w10="urn:schemas-microsoft-com:office:word" xmlns:w="http://schemas.openxmlformats.org/wordprocessingml/2006/main" xmlns:w14="http://schemas.microsoft.com/office/word/2010/wordml" xmlns:w15="http://schemas.microsoft.com/office/word/2012/wordml" xmlns:w16cei="http://schemas.microsoft.com/office/word/2026/wordml/cei" xmlns:w16cex="http://schemas.microsoft.com/office/word/2018/wordml/cex" xmlns:w16cid="http://schemas.microsoft.com/office/word/2016/wordml/cid" xmlns:w16="http://schemas.microsoft.com/office/word/2018/wordml" xmlns:w16du="http://schemas.microsoft.com/office/word/2023/wordml/word16du" xmlns:w16sdtdh="http://schemas.microsoft.com/office/word/2020/wordml/sdtdatahash" xmlns:w16sdtfl="http://schemas.microsoft.com/office/word/2024/wordml/sdtformatlock" xmlns:w16se="http://schemas.microsoft.com/office/word/2015/wordml/symex" xmlns:wpg="http://schemas.microsoft.com/office/word/2010/wordprocessingGroup" xmlns:wpi="http://schemas.microsoft.com/office/word/2010/wordprocessingInk" xmlns:wne="http://schemas.microsoft.com/office/word/2006/wordml" xmlns:wps="http://schemas.microsoft.com/office/word/2010/wordprocessingShape" mc:Ignorable="w14 w15 w16se w16cid w16 w16cex w16sdtdh w16sdtfl w16du wp14">
   <w:p>
     <w:pPr>
@@ -11324,6 +11992,16 @@
 </w:ftr>
 </file>
 
+<file path=word/footer3.xml><?xml version="1.0" encoding="utf-8"?>
+<w:ftr xmlns:wpc="http://schemas.microsoft.com/office/word/2010/wordprocessingCanvas" xmlns:cx="http://schemas.microsoft.com/office/drawing/2014/chartex" xmlns:cx1="http://schemas.microsoft.com/office/drawing/2015/9/8/chartex" xmlns:cx2="http://schemas.microsoft.com/office/drawing/2015/10/21/chartex" xmlns:cx3="http://schemas.microsoft.com/office/drawing/2016/5/9/chartex" xmlns:cx4="http://schemas.microsoft.com/office/drawing/2016/5/10/chartex" xmlns:cx5="http://schemas.microsoft.com/office/drawing/2016/5/11/chartex" xmlns:cx6="http://schemas.microsoft.com/office/drawing/2016/5/12/chartex" xmlns:cx7="http://schemas.microsoft.com/office/drawing/2016/5/13/chartex" xmlns:cx8="http://schemas.microsoft.com/office/drawing/2016/5/14/chartex" xmlns:mc="http://schemas.openxmlformats.org/markup-compatibility/2006" xmlns:aink="http://schemas.microsoft.com/office/drawing/2016/ink" xmlns:am3d="http://schemas.microsoft.com/office/drawing/2017/model3d" xmlns:o="urn:schemas-microsoft-com:office:office" xmlns:oel="http://schemas.microsoft.com/office/2019/extlst" xmlns:r="http://schemas.openxmlformats.org/officeDocument/2006/relationships" xmlns:m="http://schemas.openxmlformats.org/officeDocument/2006/math" xmlns:v="urn:schemas-microsoft-com:vml" xmlns:wp14="http://schemas.microsoft.com/office/word/2010/wordprocessingDrawing" xmlns:wp="http://schemas.openxmlformats.org/drawingml/2006/wordprocessingDrawing" xmlns:w10="urn:schemas-microsoft-com:office:word" xmlns:w="http://schemas.openxmlformats.org/wordprocessingml/2006/main" xmlns:w14="http://schemas.microsoft.com/office/word/2010/wordml" xmlns:w15="http://schemas.microsoft.com/office/word/2012/wordml" xmlns:w16cei="http://schemas.microsoft.com/office/word/2026/wordml/cei" xmlns:w16cex="http://schemas.microsoft.com/office/word/2018/wordml/cex" xmlns:w16cid="http://schemas.microsoft.com/office/word/2016/wordml/cid" xmlns:w16="http://schemas.microsoft.com/office/word/2018/wordml" xmlns:w16du="http://schemas.microsoft.com/office/word/2023/wordml/word16du" xmlns:w16sdtdh="http://schemas.microsoft.com/office/word/2020/wordml/sdtdatahash" xmlns:w16sdtfl="http://schemas.microsoft.com/office/word/2024/wordml/sdtformatlock" xmlns:w16se="http://schemas.microsoft.com/office/word/2015/wordml/symex" xmlns:wpg="http://schemas.microsoft.com/office/word/2010/wordprocessingGroup" xmlns:wpi="http://schemas.microsoft.com/office/word/2010/wordprocessingInk" xmlns:wne="http://schemas.microsoft.com/office/word/2006/wordml" xmlns:wps="http://schemas.microsoft.com/office/word/2010/wordprocessingShape" mc:Ignorable="w14 w15 w16se w16cid w16 w16cex w16sdtdh w16sdtfl w16du wp14">
+  <w:p>
+    <w:pPr>
+      <w:pStyle w:val="Footer"/>
+    </w:pPr>
+  </w:p>
+</w:ftr>
+</file>
+
 <file path=word/footnotes.xml><?xml version="1.0" encoding="utf-8"?>
 <w:footnotes xmlns:wpc="http://schemas.microsoft.com/office/word/2010/wordprocessingCanvas" xmlns:cx="http://schemas.microsoft.com/office/drawing/2014/chartex" xmlns:cx1="http://schemas.microsoft.com/office/drawing/2015/9/8/chartex" xmlns:cx2="http://schemas.microsoft.com/office/drawing/2015/10/21/chartex" xmlns:cx3="http://schemas.microsoft.com/office/drawing/2016/5/9/chartex" xmlns:cx4="http://schemas.microsoft.com/office/drawing/2016/5/10/chartex" xmlns:cx5="http://schemas.microsoft.com/office/drawing/2016/5/11/chartex" xmlns:cx6="http://schemas.microsoft.com/office/drawing/2016/5/12/chartex" xmlns:cx7="http://schemas.microsoft.com/office/drawing/2016/5/13/chartex" xmlns:cx8="http://schemas.microsoft.com/office/drawing/2016/5/14/chartex" xmlns:mc="http://schemas.openxmlformats.org/markup-compatibility/2006" xmlns:aink="http://schemas.microsoft.com/office/drawing/2016/ink" xmlns:am3d="http://schemas.microsoft.com/office/drawing/2017/model3d" xmlns:o="urn:schemas-microsoft-com:office:office" xmlns:oel="http://schemas.microsoft.com/office/2019/extlst" xmlns:r="http://schemas.openxmlformats.org/officeDocument/2006/relationships" xmlns:m="http://schemas.openxmlformats.org/officeDocument/2006/math" xmlns:v="urn:schemas-microsoft-com:vml" xmlns:wp14="http://schemas.microsoft.com/office/word/2010/wordprocessingDrawing" xmlns:wp="http://schemas.openxmlformats.org/drawingml/2006/wordprocessingDrawing" xmlns:w10="urn:schemas-microsoft-com:office:word" xmlns:w="http://schemas.openxmlformats.org/wordprocessingml/2006/main" xmlns:w14="http://schemas.microsoft.com/office/word/2010/wordml" xmlns:w15="http://schemas.microsoft.com/office/word/2012/wordml" xmlns:w16cei="http://schemas.microsoft.com/office/word/2026/wordml/cei" xmlns:w16cex="http://schemas.microsoft.com/office/word/2018/wordml/cex" xmlns:w16cid="http://schemas.microsoft.com/office/word/2016/wordml/cid" xmlns:w16="http://schemas.microsoft.com/office/word/2018/wordml" xmlns:w16du="http://schemas.microsoft.com/office/word/2023/wordml/word16du" xmlns:w16sdtdh="http://schemas.microsoft.com/office/word/2020/wordml/sdtdatahash" xmlns:w16sdtfl="http://schemas.microsoft.com/office/word/2024/wordml/sdtformatlock" xmlns:w16se="http://schemas.microsoft.com/office/word/2015/wordml/symex" xmlns:wpg="http://schemas.microsoft.com/office/word/2010/wordprocessingGroup" xmlns:wpi="http://schemas.microsoft.com/office/word/2010/wordprocessingInk" xmlns:wne="http://schemas.microsoft.com/office/word/2006/wordml" xmlns:wps="http://schemas.microsoft.com/office/word/2010/wordprocessingShape" mc:Ignorable="w14 w15 w16se w16cid w16 w16cex w16sdtdh w16sdtfl w16du wp14">
   <w:footnote w:type="separator" w:id="-1">
@@ -11347,6 +12025,16 @@
 <w:hdr xmlns:wpc="http://schemas.microsoft.com/office/word/2010/wordprocessingCanvas" xmlns:cx="http://schemas.microsoft.com/office/drawing/2014/chartex" xmlns:cx1="http://schemas.microsoft.com/office/drawing/2015/9/8/chartex" xmlns:cx2="http://schemas.microsoft.com/office/drawing/2015/10/21/chartex" xmlns:cx3="http://schemas.microsoft.com/office/drawing/2016/5/9/chartex" xmlns:cx4="http://schemas.microsoft.com/office/drawing/2016/5/10/chartex" xmlns:cx5="http://schemas.microsoft.com/office/drawing/2016/5/11/chartex" xmlns:cx6="http://schemas.microsoft.com/office/drawing/2016/5/12/chartex" xmlns:cx7="http://schemas.microsoft.com/office/drawing/2016/5/13/chartex" xmlns:cx8="http://schemas.microsoft.com/office/drawing/2016/5/14/chartex" xmlns:mc="http://schemas.openxmlformats.org/markup-compatibility/2006" xmlns:aink="http://schemas.microsoft.com/office/drawing/2016/ink" xmlns:am3d="http://schemas.microsoft.com/office/drawing/2017/model3d" xmlns:o="urn:schemas-microsoft-com:office:office" xmlns:oel="http://schemas.microsoft.com/office/2019/extlst" xmlns:r="http://schemas.openxmlformats.org/officeDocument/2006/relationships" xmlns:m="http://schemas.openxmlformats.org/officeDocument/2006/math" xmlns:v="urn:schemas-microsoft-com:vml" xmlns:wp14="http://schemas.microsoft.com/office/word/2010/wordprocessingDrawing" xmlns:wp="http://schemas.openxmlformats.org/drawingml/2006/wordprocessingDrawing" xmlns:w10="urn:schemas-microsoft-com:office:word" xmlns:w="http://schemas.openxmlformats.org/wordprocessingml/2006/main" xmlns:w14="http://schemas.microsoft.com/office/word/2010/wordml" xmlns:w15="http://schemas.microsoft.com/office/word/2012/wordml" xmlns:w16cei="http://schemas.microsoft.com/office/word/2026/wordml/cei" xmlns:w16cex="http://schemas.microsoft.com/office/word/2018/wordml/cex" xmlns:w16cid="http://schemas.microsoft.com/office/word/2016/wordml/cid" xmlns:w16="http://schemas.microsoft.com/office/word/2018/wordml" xmlns:w16du="http://schemas.microsoft.com/office/word/2023/wordml/word16du" xmlns:w16sdtdh="http://schemas.microsoft.com/office/word/2020/wordml/sdtdatahash" xmlns:w16sdtfl="http://schemas.microsoft.com/office/word/2024/wordml/sdtformatlock" xmlns:w16se="http://schemas.microsoft.com/office/word/2015/wordml/symex" xmlns:wpg="http://schemas.microsoft.com/office/word/2010/wordprocessingGroup" xmlns:wpi="http://schemas.microsoft.com/office/word/2010/wordprocessingInk" xmlns:wne="http://schemas.microsoft.com/office/word/2006/wordml" xmlns:wps="http://schemas.microsoft.com/office/word/2010/wordprocessingShape" mc:Ignorable="w14 w15 w16se w16cid w16 w16cex w16sdtdh w16sdtfl w16du wp14">
   <w:p>
     <w:pPr>
+      <w:pStyle w:val="Header"/>
+    </w:pPr>
+  </w:p>
+</w:hdr>
+</file>
+
+<file path=word/header2.xml><?xml version="1.0" encoding="utf-8"?>
+<w:hdr xmlns:wpc="http://schemas.microsoft.com/office/word/2010/wordprocessingCanvas" xmlns:cx="http://schemas.microsoft.com/office/drawing/2014/chartex" xmlns:cx1="http://schemas.microsoft.com/office/drawing/2015/9/8/chartex" xmlns:cx2="http://schemas.microsoft.com/office/drawing/2015/10/21/chartex" xmlns:cx3="http://schemas.microsoft.com/office/drawing/2016/5/9/chartex" xmlns:cx4="http://schemas.microsoft.com/office/drawing/2016/5/10/chartex" xmlns:cx5="http://schemas.microsoft.com/office/drawing/2016/5/11/chartex" xmlns:cx6="http://schemas.microsoft.com/office/drawing/2016/5/12/chartex" xmlns:cx7="http://schemas.microsoft.com/office/drawing/2016/5/13/chartex" xmlns:cx8="http://schemas.microsoft.com/office/drawing/2016/5/14/chartex" xmlns:mc="http://schemas.openxmlformats.org/markup-compatibility/2006" xmlns:aink="http://schemas.microsoft.com/office/drawing/2016/ink" xmlns:am3d="http://schemas.microsoft.com/office/drawing/2017/model3d" xmlns:o="urn:schemas-microsoft-com:office:office" xmlns:oel="http://schemas.microsoft.com/office/2019/extlst" xmlns:r="http://schemas.openxmlformats.org/officeDocument/2006/relationships" xmlns:m="http://schemas.openxmlformats.org/officeDocument/2006/math" xmlns:v="urn:schemas-microsoft-com:vml" xmlns:wp14="http://schemas.microsoft.com/office/word/2010/wordprocessingDrawing" xmlns:wp="http://schemas.openxmlformats.org/drawingml/2006/wordprocessingDrawing" xmlns:w10="urn:schemas-microsoft-com:office:word" xmlns:w="http://schemas.openxmlformats.org/wordprocessingml/2006/main" xmlns:w14="http://schemas.microsoft.com/office/word/2010/wordml" xmlns:w15="http://schemas.microsoft.com/office/word/2012/wordml" xmlns:w16cei="http://schemas.microsoft.com/office/word/2026/wordml/cei" xmlns:w16cex="http://schemas.microsoft.com/office/word/2018/wordml/cex" xmlns:w16cid="http://schemas.microsoft.com/office/word/2016/wordml/cid" xmlns:w16="http://schemas.microsoft.com/office/word/2018/wordml" xmlns:w16du="http://schemas.microsoft.com/office/word/2023/wordml/word16du" xmlns:w16sdtdh="http://schemas.microsoft.com/office/word/2020/wordml/sdtdatahash" xmlns:w16sdtfl="http://schemas.microsoft.com/office/word/2024/wordml/sdtformatlock" xmlns:w16se="http://schemas.microsoft.com/office/word/2015/wordml/symex" xmlns:wpg="http://schemas.microsoft.com/office/word/2010/wordprocessingGroup" xmlns:wpi="http://schemas.microsoft.com/office/word/2010/wordprocessingInk" xmlns:wne="http://schemas.microsoft.com/office/word/2006/wordml" xmlns:wps="http://schemas.microsoft.com/office/word/2010/wordprocessingShape" mc:Ignorable="w14 w15 w16se w16cid w16 w16cex w16sdtdh w16sdtfl w16du wp14">
+  <w:p>
+    <w:pPr>
       <w:jc w:val="right"/>
     </w:pPr>
     <w:r>
@@ -11355,8 +12043,36 @@
         <w:sz w:val="16"/>
         <w:szCs w:val="16"/>
       </w:rPr>
-      <w:t>Numerical Computing II — Assignment III  |  Kunal Kamod (MS2513)</w:t>
+      <w:t xml:space="preserve">Numerical Computing II — Assignment </w:t>
     </w:r>
+    <w:proofErr w:type="gramStart"/>
+    <w:r>
+      <w:rPr>
+        <w:color w:val="888888"/>
+        <w:sz w:val="16"/>
+        <w:szCs w:val="16"/>
+      </w:rPr>
+      <w:t>III  |</w:t>
+    </w:r>
+    <w:proofErr w:type="gramEnd"/>
+    <w:r>
+      <w:rPr>
+        <w:color w:val="888888"/>
+        <w:sz w:val="16"/>
+        <w:szCs w:val="16"/>
+      </w:rPr>
+      <w:t xml:space="preserve">  Kunal Kamod (MS2513)</w:t>
+    </w:r>
+  </w:p>
+</w:hdr>
+</file>
+
+<file path=word/header3.xml><?xml version="1.0" encoding="utf-8"?>
+<w:hdr xmlns:wpc="http://schemas.microsoft.com/office/word/2010/wordprocessingCanvas" xmlns:cx="http://schemas.microsoft.com/office/drawing/2014/chartex" xmlns:cx1="http://schemas.microsoft.com/office/drawing/2015/9/8/chartex" xmlns:cx2="http://schemas.microsoft.com/office/drawing/2015/10/21/chartex" xmlns:cx3="http://schemas.microsoft.com/office/drawing/2016/5/9/chartex" xmlns:cx4="http://schemas.microsoft.com/office/drawing/2016/5/10/chartex" xmlns:cx5="http://schemas.microsoft.com/office/drawing/2016/5/11/chartex" xmlns:cx6="http://schemas.microsoft.com/office/drawing/2016/5/12/chartex" xmlns:cx7="http://schemas.microsoft.com/office/drawing/2016/5/13/chartex" xmlns:cx8="http://schemas.microsoft.com/office/drawing/2016/5/14/chartex" xmlns:mc="http://schemas.openxmlformats.org/markup-compatibility/2006" xmlns:aink="http://schemas.microsoft.com/office/drawing/2016/ink" xmlns:am3d="http://schemas.microsoft.com/office/drawing/2017/model3d" xmlns:o="urn:schemas-microsoft-com:office:office" xmlns:oel="http://schemas.microsoft.com/office/2019/extlst" xmlns:r="http://schemas.openxmlformats.org/officeDocument/2006/relationships" xmlns:m="http://schemas.openxmlformats.org/officeDocument/2006/math" xmlns:v="urn:schemas-microsoft-com:vml" xmlns:wp14="http://schemas.microsoft.com/office/word/2010/wordprocessingDrawing" xmlns:wp="http://schemas.openxmlformats.org/drawingml/2006/wordprocessingDrawing" xmlns:w10="urn:schemas-microsoft-com:office:word" xmlns:w="http://schemas.openxmlformats.org/wordprocessingml/2006/main" xmlns:w14="http://schemas.microsoft.com/office/word/2010/wordml" xmlns:w15="http://schemas.microsoft.com/office/word/2012/wordml" xmlns:w16cei="http://schemas.microsoft.com/office/word/2026/wordml/cei" xmlns:w16cex="http://schemas.microsoft.com/office/word/2018/wordml/cex" xmlns:w16cid="http://schemas.microsoft.com/office/word/2016/wordml/cid" xmlns:w16="http://schemas.microsoft.com/office/word/2018/wordml" xmlns:w16du="http://schemas.microsoft.com/office/word/2023/wordml/word16du" xmlns:w16sdtdh="http://schemas.microsoft.com/office/word/2020/wordml/sdtdatahash" xmlns:w16sdtfl="http://schemas.microsoft.com/office/word/2024/wordml/sdtformatlock" xmlns:w16se="http://schemas.microsoft.com/office/word/2015/wordml/symex" xmlns:wpg="http://schemas.microsoft.com/office/word/2010/wordprocessingGroup" xmlns:wpi="http://schemas.microsoft.com/office/word/2010/wordprocessingInk" xmlns:wne="http://schemas.microsoft.com/office/word/2006/wordml" xmlns:wps="http://schemas.microsoft.com/office/word/2010/wordprocessingShape" mc:Ignorable="w14 w15 w16se w16cid w16 w16cex w16sdtdh w16sdtfl w16du wp14">
+  <w:p>
+    <w:pPr>
+      <w:pStyle w:val="Header"/>
+    </w:pPr>
   </w:p>
 </w:hdr>
 </file>
@@ -12099,6 +12815,60 @@
       <w:szCs w:val="20"/>
     </w:rPr>
   </w:style>
+  <w:style w:type="paragraph" w:styleId="Header">
+    <w:name w:val="header"/>
+    <w:basedOn w:val="Normal"/>
+    <w:link w:val="HeaderChar"/>
+    <w:uiPriority w:val="99"/>
+    <w:unhideWhenUsed/>
+    <w:rsid w:val="00A969D4"/>
+    <w:pPr>
+      <w:tabs>
+        <w:tab w:val="center" w:pos="4513"/>
+        <w:tab w:val="right" w:pos="9026"/>
+      </w:tabs>
+    </w:pPr>
+    <w:rPr>
+      <w:szCs w:val="18"/>
+    </w:rPr>
+  </w:style>
+  <w:style w:type="character" w:customStyle="1" w:styleId="HeaderChar">
+    <w:name w:val="Header Char"/>
+    <w:basedOn w:val="DefaultParagraphFont"/>
+    <w:link w:val="Header"/>
+    <w:uiPriority w:val="99"/>
+    <w:rsid w:val="00A969D4"/>
+    <w:rPr>
+      <w:szCs w:val="18"/>
+    </w:rPr>
+  </w:style>
+  <w:style w:type="paragraph" w:styleId="Footer">
+    <w:name w:val="footer"/>
+    <w:basedOn w:val="Normal"/>
+    <w:link w:val="FooterChar"/>
+    <w:uiPriority w:val="99"/>
+    <w:unhideWhenUsed/>
+    <w:rsid w:val="00A969D4"/>
+    <w:pPr>
+      <w:tabs>
+        <w:tab w:val="center" w:pos="4513"/>
+        <w:tab w:val="right" w:pos="9026"/>
+      </w:tabs>
+    </w:pPr>
+    <w:rPr>
+      <w:szCs w:val="18"/>
+    </w:rPr>
+  </w:style>
+  <w:style w:type="character" w:customStyle="1" w:styleId="FooterChar">
+    <w:name w:val="Footer Char"/>
+    <w:basedOn w:val="DefaultParagraphFont"/>
+    <w:link w:val="Footer"/>
+    <w:uiPriority w:val="99"/>
+    <w:rsid w:val="00A969D4"/>
+    <w:rPr>
+      <w:szCs w:val="18"/>
+    </w:rPr>
+  </w:style>
 </w:styles>
 </file>
 

</xml_diff>